<commit_message>
Izbaci pitanja o VVL Brothers i Vidu iz DOCX liste
Ostalo 84 top-level pitanja, sortirana po lajkovima.

Co-authored-by: DamboSlonce <DamboSlonce@users.noreply.github.com>
</commit_message>
<xml_diff>
--- a/Dokumentacija/TikTok_pitanja_vukasin_vvl_po_lajkovima.docx
+++ b/Dokumentacija/TikTok_pitanja_vukasin_vvl_po_lajkovima.docx
@@ -22,13 +22,15 @@
       <w:r>
         <w:t>Video: https://www.tiktok.com/@vukasin.vvl/video/7688407288696032532</w:t>
         <w:br/>
-        <w:t>Dostupnih komentara (javni API): 298 / 567 na TikToku</w:t>
+        <w:t>Samo top-level pitanja, bez odgovora na komentare</w:t>
         <w:br/>
-        <w:t>Samo top-level pitanja (bez odgovora na komentare): 97</w:t>
+        <w:t>Isključeno: pitanja koja spominju VVL / VVL Brothers / Vid</w:t>
+        <w:br/>
+        <w:t>Broj pitanja: 84</w:t>
         <w:br/>
         <w:t>Sortiranje: opadajuće po lajkovima</w:t>
         <w:br/>
-        <w:t>Generisano: 2026-09-25 16:09 UTC</w:t>
+        <w:t>Generisano: 2026-09-25 16:28 UTC</w:t>
       </w:r>
     </w:p>
     <w:p/>
@@ -66,19 +68,19 @@
         <w:rPr>
           <w:b/>
         </w:rPr>
-        <w:t xml:space="preserve">2.  2044❤  </w:t>
+        <w:t xml:space="preserve">2.  1868❤  </w:t>
       </w:r>
       <w:r>
         <w:rPr>
           <w:b/>
         </w:rPr>
-        <w:t>Росић🎰 (@rosic.95)</w:t>
+        <w:t>Vid (@vid.vvl)</w:t>
       </w:r>
       <w:r>
         <w:t xml:space="preserve">  ·  Liked by creator</w:t>
       </w:r>
       <w:r>
-        <w:t xml:space="preserve">  ·  2026-09-22 17:39</w:t>
+        <w:t xml:space="preserve">  ·  2026-09-22 17:24</w:t>
       </w:r>
     </w:p>
     <w:p>
@@ -87,7 +89,7 @@
         <w:ind w:left="283"/>
       </w:pPr>
       <w:r>
-        <w:t>Da li je ovaj brat bio u vvl brothers?</w:t>
+        <w:t>Jesam ti nedostajao?</w:t>
       </w:r>
     </w:p>
     <w:p>
@@ -95,19 +97,19 @@
         <w:rPr>
           <w:b/>
         </w:rPr>
-        <w:t xml:space="preserve">3.  1868❤  </w:t>
+        <w:t xml:space="preserve">3.  949❤  </w:t>
       </w:r>
       <w:r>
         <w:rPr>
           <w:b/>
         </w:rPr>
-        <w:t>Vid (@vid.vvl)</w:t>
+        <w:t>ante vrankić (@antevrankic)</w:t>
       </w:r>
       <w:r>
         <w:t xml:space="preserve">  ·  Liked by creator</w:t>
       </w:r>
       <w:r>
-        <w:t xml:space="preserve">  ·  2026-09-22 17:24</w:t>
+        <w:t xml:space="preserve">  ·  2026-09-23 20:24</w:t>
       </w:r>
     </w:p>
     <w:p>
@@ -116,7 +118,7 @@
         <w:ind w:left="283"/>
       </w:pPr>
       <w:r>
-        <w:t>Jesam ti nedostajao?</w:t>
+        <w:t>ko ti se od muskaraca najvise svidio?</w:t>
       </w:r>
     </w:p>
     <w:p>
@@ -124,19 +126,19 @@
         <w:rPr>
           <w:b/>
         </w:rPr>
-        <w:t xml:space="preserve">4.  949❤  </w:t>
+        <w:t xml:space="preserve">4.  526❤  </w:t>
       </w:r>
       <w:r>
         <w:rPr>
           <w:b/>
         </w:rPr>
-        <w:t>ante vrankić (@antevrankic)</w:t>
+        <w:t>🎀 (@katakolman)</w:t>
       </w:r>
       <w:r>
         <w:t xml:space="preserve">  ·  Liked by creator</w:t>
       </w:r>
       <w:r>
-        <w:t xml:space="preserve">  ·  2026-09-23 20:24</w:t>
+        <w:t xml:space="preserve">  ·  2026-09-22 17:32</w:t>
       </w:r>
     </w:p>
     <w:p>
@@ -145,7 +147,7 @@
         <w:ind w:left="283"/>
       </w:pPr>
       <w:r>
-        <w:t>ko ti se od muskaraca najvise svidio?</w:t>
+        <w:t>da li ti nedostaje Tara I da li ces nastaviti posle love island andria da se vidjas sa njom</w:t>
       </w:r>
     </w:p>
     <w:p>
@@ -153,19 +155,16 @@
         <w:rPr>
           <w:b/>
         </w:rPr>
-        <w:t xml:space="preserve">5.  526❤  </w:t>
+        <w:t xml:space="preserve">5.  523❤  </w:t>
       </w:r>
       <w:r>
         <w:rPr>
           <w:b/>
         </w:rPr>
-        <w:t>🎀 (@katakolman)</w:t>
-      </w:r>
-      <w:r>
-        <w:t xml:space="preserve">  ·  Liked by creator</w:t>
-      </w:r>
-      <w:r>
-        <w:t xml:space="preserve">  ·  2026-09-22 17:32</w:t>
+        <w:t>emy.core (@my.myself.i.core)</w:t>
+      </w:r>
+      <w:r>
+        <w:t xml:space="preserve">  ·  2026-09-22 19:12</w:t>
       </w:r>
     </w:p>
     <w:p>
@@ -174,7 +173,7 @@
         <w:ind w:left="283"/>
       </w:pPr>
       <w:r>
-        <w:t>da li ti nedostaje Tara I da li ces nastaviti posle love island andria da se vidjas sa njom</w:t>
+        <w:t>rekao si da su zene mid i da su momci ulov, da li ostajes pri tome?</w:t>
       </w:r>
     </w:p>
     <w:p>
@@ -182,16 +181,19 @@
         <w:rPr>
           <w:b/>
         </w:rPr>
-        <w:t xml:space="preserve">6.  523❤  </w:t>
+        <w:t xml:space="preserve">6.  281❤  </w:t>
       </w:r>
       <w:r>
         <w:rPr>
           <w:b/>
         </w:rPr>
-        <w:t>emy.core (@my.myself.i.core)</w:t>
-      </w:r>
-      <w:r>
-        <w:t xml:space="preserve">  ·  2026-09-22 19:12</w:t>
+        <w:t>L (@cookiemookie11)</w:t>
+      </w:r>
+      <w:r>
+        <w:t xml:space="preserve">  ·  Liked by creator</w:t>
+      </w:r>
+      <w:r>
+        <w:t xml:space="preserve">  ·  2026-09-22 17:39</w:t>
       </w:r>
     </w:p>
     <w:p>
@@ -200,7 +202,7 @@
         <w:ind w:left="283"/>
       </w:pPr>
       <w:r>
-        <w:t>rekao si da su zene mid i da su momci ulov, da li ostajes pri tome?</w:t>
+        <w:t>Koje je tvoje mišljenje o ovoj kontraverznoj osmoj epizodi</w:t>
       </w:r>
     </w:p>
     <w:p>
@@ -208,19 +210,19 @@
         <w:rPr>
           <w:b/>
         </w:rPr>
-        <w:t xml:space="preserve">7.  281❤  </w:t>
+        <w:t xml:space="preserve">7.  244❤  </w:t>
       </w:r>
       <w:r>
         <w:rPr>
           <w:b/>
         </w:rPr>
-        <w:t>L (@cookiemookie11)</w:t>
+        <w:t>UltraVision song contest (@ultra.vision2026)</w:t>
       </w:r>
       <w:r>
         <w:t xml:space="preserve">  ·  Liked by creator</w:t>
       </w:r>
       <w:r>
-        <w:t xml:space="preserve">  ·  2026-09-22 17:39</w:t>
+        <w:t xml:space="preserve">  ·  2026-09-22 17:52</w:t>
       </w:r>
     </w:p>
     <w:p>
@@ -229,7 +231,7 @@
         <w:ind w:left="283"/>
       </w:pPr>
       <w:r>
-        <w:t>Koje je tvoje mišljenje o ovoj kontraverznoj osmoj epizodi</w:t>
+        <w:t>Šta se desilo u vili a da nisu prikazali?</w:t>
       </w:r>
     </w:p>
     <w:p>
@@ -237,19 +239,19 @@
         <w:rPr>
           <w:b/>
         </w:rPr>
-        <w:t xml:space="preserve">8.  244❤  </w:t>
+        <w:t xml:space="preserve">8.  111❤  </w:t>
       </w:r>
       <w:r>
         <w:rPr>
           <w:b/>
         </w:rPr>
-        <w:t>UltraVision song contest (@ultra.vision2026)</w:t>
+        <w:t>I (@iskra.banovicc)</w:t>
       </w:r>
       <w:r>
         <w:t xml:space="preserve">  ·  Liked by creator</w:t>
       </w:r>
       <w:r>
-        <w:t xml:space="preserve">  ·  2026-09-22 17:52</w:t>
+        <w:t xml:space="preserve">  ·  2026-09-22 18:39</w:t>
       </w:r>
     </w:p>
     <w:p>
@@ -258,7 +260,7 @@
         <w:ind w:left="283"/>
       </w:pPr>
       <w:r>
-        <w:t>Šta se desilo u vili a da nisu prikazali?</w:t>
+        <w:t>Jel cete ti i tara da se čujete kada se love island zavrsi</w:t>
       </w:r>
     </w:p>
     <w:p>
@@ -266,19 +268,16 @@
         <w:rPr>
           <w:b/>
         </w:rPr>
-        <w:t xml:space="preserve">9.  111❤  </w:t>
+        <w:t xml:space="preserve">9.  39❤  </w:t>
       </w:r>
       <w:r>
         <w:rPr>
           <w:b/>
         </w:rPr>
-        <w:t>I (@iskra.banovicc)</w:t>
-      </w:r>
-      <w:r>
-        <w:t xml:space="preserve">  ·  Liked by creator</w:t>
-      </w:r>
-      <w:r>
-        <w:t xml:space="preserve">  ·  2026-09-22 18:39</w:t>
+        <w:t>ℒℯ𝓃𝓀𝒶🎞 (@llenka.obradovic)</w:t>
+      </w:r>
+      <w:r>
+        <w:t xml:space="preserve">  ·  2026-09-23 11:06</w:t>
       </w:r>
     </w:p>
     <w:p>
@@ -287,7 +286,7 @@
         <w:ind w:left="283"/>
       </w:pPr>
       <w:r>
-        <w:t>Jel cete ti i tara da se čujete kada se love island zavrsi</w:t>
+        <w:t>Hoces li nastaviti da se viđas sa Tarom nakon love island</w:t>
       </w:r>
     </w:p>
     <w:p>
@@ -295,16 +294,19 @@
         <w:rPr>
           <w:b/>
         </w:rPr>
-        <w:t xml:space="preserve">10.  39❤  </w:t>
+        <w:t xml:space="preserve">10.  29❤  </w:t>
       </w:r>
       <w:r>
         <w:rPr>
           <w:b/>
         </w:rPr>
-        <w:t>ℒℯ𝓃𝓀𝒶🎞 (@llenka.obradovic)</w:t>
-      </w:r>
-      <w:r>
-        <w:t xml:space="preserve">  ·  2026-09-23 11:06</w:t>
+        <w:t>userrr12 (@userrr120385)</w:t>
+      </w:r>
+      <w:r>
+        <w:t xml:space="preserve">  ·  Liked by creator</w:t>
+      </w:r>
+      <w:r>
+        <w:t xml:space="preserve">  ·  2026-09-22 18:03</w:t>
       </w:r>
     </w:p>
     <w:p>
@@ -313,7 +315,7 @@
         <w:ind w:left="283"/>
       </w:pPr>
       <w:r>
-        <w:t>Hoces li nastaviti da se viđas sa Tarom nakon love island</w:t>
+        <w:t>Da li su ti možda oni rekli da postoji šansa da se vratiš i da li bi se vratio kad bi te pozvali?</w:t>
       </w:r>
     </w:p>
     <w:p>
@@ -321,19 +323,19 @@
         <w:rPr>
           <w:b/>
         </w:rPr>
-        <w:t xml:space="preserve">11.  37❤  </w:t>
+        <w:t xml:space="preserve">11.  16❤  </w:t>
       </w:r>
       <w:r>
         <w:rPr>
           <w:b/>
         </w:rPr>
-        <w:t>Kika🇷🇸🏀🎸 (@kristinaiva3162)</w:t>
+        <w:t>Nadja🌸💗🌺 (@nadja1561)</w:t>
       </w:r>
       <w:r>
         <w:t xml:space="preserve">  ·  Liked by creator</w:t>
       </w:r>
       <w:r>
-        <w:t xml:space="preserve">  ·  2026-09-22 18:02</w:t>
+        <w:t xml:space="preserve">  ·  2026-09-22 18:36</w:t>
       </w:r>
     </w:p>
     <w:p>
@@ -342,7 +344,7 @@
         <w:ind w:left="283"/>
       </w:pPr>
       <w:r>
-        <w:t>Oćeš li opet doći u VVL brothers</w:t>
+        <w:t>Ko te najvise nerviro</w:t>
       </w:r>
     </w:p>
     <w:p>
@@ -350,19 +352,16 @@
         <w:rPr>
           <w:b/>
         </w:rPr>
-        <w:t xml:space="preserve">12.  29❤  </w:t>
+        <w:t xml:space="preserve">12.  15❤  </w:t>
       </w:r>
       <w:r>
         <w:rPr>
           <w:b/>
         </w:rPr>
-        <w:t>userrr12 (@userrr120385)</w:t>
-      </w:r>
-      <w:r>
-        <w:t xml:space="preserve">  ·  Liked by creator</w:t>
-      </w:r>
-      <w:r>
-        <w:t xml:space="preserve">  ·  2026-09-22 18:03</w:t>
+        <w:t>kulja_f (@kulja_f)</w:t>
+      </w:r>
+      <w:r>
+        <w:t xml:space="preserve">  ·  2026-09-22 17:13</w:t>
       </w:r>
     </w:p>
     <w:p>
@@ -371,7 +370,7 @@
         <w:ind w:left="283"/>
       </w:pPr>
       <w:r>
-        <w:t>Da li su ti možda oni rekli da postoji šansa da se vratiš i da li bi se vratio kad bi te pozvali?</w:t>
+        <w:t>Koje ovde pre 5 lajkova</w:t>
       </w:r>
     </w:p>
     <w:p>
@@ -379,19 +378,19 @@
         <w:rPr>
           <w:b/>
         </w:rPr>
-        <w:t xml:space="preserve">13.  16❤  </w:t>
+        <w:t xml:space="preserve">13.  15❤  </w:t>
       </w:r>
       <w:r>
         <w:rPr>
           <w:b/>
         </w:rPr>
-        <w:t>Nadja🌸💗🌺 (@nadja1561)</w:t>
+        <w:t>jj (@jj73288)</w:t>
       </w:r>
       <w:r>
         <w:t xml:space="preserve">  ·  Liked by creator</w:t>
       </w:r>
       <w:r>
-        <w:t xml:space="preserve">  ·  2026-09-22 18:36</w:t>
+        <w:t xml:space="preserve">  ·  2026-09-22 17:51</w:t>
       </w:r>
     </w:p>
     <w:p>
@@ -400,7 +399,7 @@
         <w:ind w:left="283"/>
       </w:pPr>
       <w:r>
-        <w:t>Ko te najvise nerviro</w:t>
+        <w:t>Možeš svaku epizodu poseban video da snimis kako analiziraš , pričaš ?</w:t>
       </w:r>
     </w:p>
     <w:p>
@@ -408,16 +407,16 @@
         <w:rPr>
           <w:b/>
         </w:rPr>
-        <w:t xml:space="preserve">14.  15❤  </w:t>
+        <w:t xml:space="preserve">14.  11❤  </w:t>
       </w:r>
       <w:r>
         <w:rPr>
           <w:b/>
         </w:rPr>
-        <w:t>kulja_f (@kulja_f)</w:t>
-      </w:r>
-      <w:r>
-        <w:t xml:space="preserve">  ·  2026-09-22 17:13</w:t>
+        <w:t>Aljosa Mirkovic (@aljosa_34)</w:t>
+      </w:r>
+      <w:r>
+        <w:t xml:space="preserve">  ·  2026-09-22 19:03</w:t>
       </w:r>
     </w:p>
     <w:p>
@@ -426,7 +425,7 @@
         <w:ind w:left="283"/>
       </w:pPr>
       <w:r>
-        <w:t>Koje ovde pre 5 lajkova</w:t>
+        <w:t>jel ovaj brat uopste bio u love islandu</w:t>
       </w:r>
     </w:p>
     <w:p>
@@ -434,19 +433,19 @@
         <w:rPr>
           <w:b/>
         </w:rPr>
-        <w:t xml:space="preserve">15.  15❤  </w:t>
+        <w:t xml:space="preserve">15.  10❤  </w:t>
       </w:r>
       <w:r>
         <w:rPr>
           <w:b/>
         </w:rPr>
-        <w:t>jj (@jj73288)</w:t>
+        <w:t>🎀 (@katakolman)</w:t>
       </w:r>
       <w:r>
         <w:t xml:space="preserve">  ·  Liked by creator</w:t>
       </w:r>
       <w:r>
-        <w:t xml:space="preserve">  ·  2026-09-22 17:51</w:t>
+        <w:t xml:space="preserve">  ·  2026-09-22 17:38</w:t>
       </w:r>
     </w:p>
     <w:p>
@@ -455,7 +454,7 @@
         <w:ind w:left="283"/>
       </w:pPr>
       <w:r>
-        <w:t>Možeš svaku epizodu poseban video da snimis kako analiziraš , pričaš ?</w:t>
+        <w:t>Ko te je najvise nervirao I da li si zamerio Luki sto ti je oteo devojku,koga bi izabrao da nisi izabrao Taru?</w:t>
       </w:r>
     </w:p>
     <w:p>
@@ -463,16 +462,19 @@
         <w:rPr>
           <w:b/>
         </w:rPr>
-        <w:t xml:space="preserve">16.  13❤  </w:t>
+        <w:t xml:space="preserve">16.  8❤  </w:t>
       </w:r>
       <w:r>
         <w:rPr>
           <w:b/>
         </w:rPr>
-        <w:t>Daanica (@danii.here160)</w:t>
-      </w:r>
-      <w:r>
-        <w:t xml:space="preserve">  ·  2026-09-22 18:10</w:t>
+        <w:t>mona (@monaperc)</w:t>
+      </w:r>
+      <w:r>
+        <w:t xml:space="preserve">  ·  Liked by creator</w:t>
+      </w:r>
+      <w:r>
+        <w:t xml:space="preserve">  ·  2026-09-23 06:13</w:t>
       </w:r>
     </w:p>
     <w:p>
@@ -481,7 +483,7 @@
         <w:ind w:left="283"/>
       </w:pPr>
       <w:r>
-        <w:t>Oćeš opet doci u vvl brothers</w:t>
+        <w:t>zasto je prvi ispao najbolji lik i najveci brat? nesto je tu sumnjuvo🤫</w:t>
       </w:r>
     </w:p>
     <w:p>
@@ -489,16 +491,16 @@
         <w:rPr>
           <w:b/>
         </w:rPr>
-        <w:t xml:space="preserve">17.  11❤  </w:t>
+        <w:t xml:space="preserve">17.  7❤  </w:t>
       </w:r>
       <w:r>
         <w:rPr>
           <w:b/>
         </w:rPr>
-        <w:t>Aljosa Mirkovic (@aljosa_34)</w:t>
-      </w:r>
-      <w:r>
-        <w:t xml:space="preserve">  ·  2026-09-22 19:03</w:t>
+        <w:t>🦕 (@unastojanovic3)</w:t>
+      </w:r>
+      <w:r>
+        <w:t xml:space="preserve">  ·  2026-09-22 19:51</w:t>
       </w:r>
     </w:p>
     <w:p>
@@ -507,7 +509,7 @@
         <w:ind w:left="283"/>
       </w:pPr>
       <w:r>
-        <w:t>jel ovaj brat uopste bio u love islandu</w:t>
+        <w:t>dali ti nedostaje Tara i jel ćete nastaviti da se vidjas snjom</w:t>
       </w:r>
     </w:p>
     <w:p>
@@ -515,19 +517,16 @@
         <w:rPr>
           <w:b/>
         </w:rPr>
-        <w:t xml:space="preserve">18.  10❤  </w:t>
+        <w:t xml:space="preserve">18.  6❤  </w:t>
       </w:r>
       <w:r>
         <w:rPr>
           <w:b/>
         </w:rPr>
-        <w:t>🎀 (@katakolman)</w:t>
-      </w:r>
-      <w:r>
-        <w:t xml:space="preserve">  ·  Liked by creator</w:t>
-      </w:r>
-      <w:r>
-        <w:t xml:space="preserve">  ·  2026-09-22 17:38</w:t>
+        <w:t>jj (@jj73288)</w:t>
+      </w:r>
+      <w:r>
+        <w:t xml:space="preserve">  ·  2026-09-22 17:49</w:t>
       </w:r>
     </w:p>
     <w:p>
@@ -536,7 +535,7 @@
         <w:ind w:left="283"/>
       </w:pPr>
       <w:r>
-        <w:t>Ko te je najvise nervirao I da li si zamerio Luki sto ti je oteo devojku,koga bi izabrao da nisi izabrao Taru?</w:t>
+        <w:t>Kad odgledas sve epizode da li misliš da su isekli bitne delove koji dosta govore i da je montaža dosta toga promenila ili je okej kako su napravili epizode</w:t>
       </w:r>
     </w:p>
     <w:p>
@@ -544,19 +543,19 @@
         <w:rPr>
           <w:b/>
         </w:rPr>
-        <w:t xml:space="preserve">19.  8❤  </w:t>
+        <w:t xml:space="preserve">19.  6❤  </w:t>
       </w:r>
       <w:r>
         <w:rPr>
           <w:b/>
         </w:rPr>
-        <w:t>mona (@monaperc)</w:t>
+        <w:t>jj (@jj73288)</w:t>
       </w:r>
       <w:r>
         <w:t xml:space="preserve">  ·  Liked by creator</w:t>
       </w:r>
       <w:r>
-        <w:t xml:space="preserve">  ·  2026-09-23 06:13</w:t>
+        <w:t xml:space="preserve">  ·  2026-09-22 17:50</w:t>
       </w:r>
     </w:p>
     <w:p>
@@ -565,7 +564,7 @@
         <w:ind w:left="283"/>
       </w:pPr>
       <w:r>
-        <w:t>zasto je prvi ispao najbolji lik i najveci brat? nesto je tu sumnjuvo🤫</w:t>
+        <w:t>Ko je tvoj favorit od parova ?</w:t>
       </w:r>
     </w:p>
     <w:p>
@@ -573,16 +572,19 @@
         <w:rPr>
           <w:b/>
         </w:rPr>
-        <w:t xml:space="preserve">20.  7❤  </w:t>
+        <w:t xml:space="preserve">20.  6❤  </w:t>
       </w:r>
       <w:r>
         <w:rPr>
           <w:b/>
         </w:rPr>
-        <w:t>🦕 (@unastojanovic3)</w:t>
-      </w:r>
-      <w:r>
-        <w:t xml:space="preserve">  ·  2026-09-22 19:51</w:t>
+        <w:t>jj (@jj73288)</w:t>
+      </w:r>
+      <w:r>
+        <w:t xml:space="preserve">  ·  Liked by creator</w:t>
+      </w:r>
+      <w:r>
+        <w:t xml:space="preserve">  ·  2026-09-22 17:52</w:t>
       </w:r>
     </w:p>
     <w:p>
@@ -591,7 +593,7 @@
         <w:ind w:left="283"/>
       </w:pPr>
       <w:r>
-        <w:t>dali ti nedostaje Tara i jel ćete nastaviti da se vidjas snjom</w:t>
+        <w:t>Koja ti je omiljena uspomena?</w:t>
       </w:r>
     </w:p>
     <w:p>
@@ -605,10 +607,10 @@
         <w:rPr>
           <w:b/>
         </w:rPr>
-        <w:t>jj (@jj73288)</w:t>
-      </w:r>
-      <w:r>
-        <w:t xml:space="preserve">  ·  2026-09-22 17:49</w:t>
+        <w:t>I L I S (@jasamilis)</w:t>
+      </w:r>
+      <w:r>
+        <w:t xml:space="preserve">  ·  2026-09-22 20:46</w:t>
       </w:r>
     </w:p>
     <w:p>
@@ -617,7 +619,7 @@
         <w:ind w:left="283"/>
       </w:pPr>
       <w:r>
-        <w:t>Kad odgledas sve epizode da li misliš da su isekli bitne delove koji dosta govore i da je montaža dosta toga promenila ili je okej kako su napravili epizode</w:t>
+        <w:t>Da li si se iznenadio kada si shvatio koliko je zapravo gledano bilo i kako apsolutno ceo Balkan prati svaki minut epizode? Jel te iznenadjuje sto internet bruji samo o Love Islandu?</w:t>
       </w:r>
     </w:p>
     <w:p>
@@ -625,19 +627,19 @@
         <w:rPr>
           <w:b/>
         </w:rPr>
-        <w:t xml:space="preserve">22.  6❤  </w:t>
+        <w:t xml:space="preserve">22.  5❤  </w:t>
       </w:r>
       <w:r>
         <w:rPr>
           <w:b/>
         </w:rPr>
-        <w:t>jj (@jj73288)</w:t>
+        <w:t>826351839j (@826351839j)</w:t>
       </w:r>
       <w:r>
         <w:t xml:space="preserve">  ·  Liked by creator</w:t>
       </w:r>
       <w:r>
-        <w:t xml:space="preserve">  ·  2026-09-22 17:50</w:t>
+        <w:t xml:space="preserve">  ·  2026-09-22 17:41</w:t>
       </w:r>
     </w:p>
     <w:p>
@@ -646,7 +648,7 @@
         <w:ind w:left="283"/>
       </w:pPr>
       <w:r>
-        <w:t>Ko je tvoj favorit od parova ?</w:t>
+        <w:t>da li si promenio misljenje o nekoj devojci, ili mozda i tari posle danasnjeg izazova? 🤔</w:t>
       </w:r>
     </w:p>
     <w:p>
@@ -654,7 +656,7 @@
         <w:rPr>
           <w:b/>
         </w:rPr>
-        <w:t xml:space="preserve">23.  6❤  </w:t>
+        <w:t xml:space="preserve">23.  5❤  </w:t>
       </w:r>
       <w:r>
         <w:rPr>
@@ -675,7 +677,7 @@
         <w:ind w:left="283"/>
       </w:pPr>
       <w:r>
-        <w:t>Koja ti je omiljena uspomena?</w:t>
+        <w:t>Šta bi uradio drugačije da možeš opet da dođeš?</w:t>
       </w:r>
     </w:p>
     <w:p>
@@ -683,16 +685,16 @@
         <w:rPr>
           <w:b/>
         </w:rPr>
-        <w:t xml:space="preserve">24.  6❤  </w:t>
+        <w:t xml:space="preserve">24.  5❤  </w:t>
       </w:r>
       <w:r>
         <w:rPr>
           <w:b/>
         </w:rPr>
-        <w:t>I L I S (@jasamilis)</w:t>
-      </w:r>
-      <w:r>
-        <w:t xml:space="preserve">  ·  2026-09-22 20:46</w:t>
+        <w:t>Nikolina (@nikolina9481)</w:t>
+      </w:r>
+      <w:r>
+        <w:t xml:space="preserve">  ·  2026-09-22 18:45</w:t>
       </w:r>
     </w:p>
     <w:p>
@@ -701,7 +703,7 @@
         <w:ind w:left="283"/>
       </w:pPr>
       <w:r>
-        <w:t>Da li si se iznenadio kada si shvatio koliko je zapravo gledano bilo i kako apsolutno ceo Balkan prati svaki minut epizode? Jel te iznenadjuje sto internet bruji samo o Love Islandu?</w:t>
+        <w:t>Da li ti nedostaje tara i koje je tvoje misljenje zato sto je luka ukrao od tebe</w:t>
       </w:r>
     </w:p>
     <w:p>
@@ -709,19 +711,16 @@
         <w:rPr>
           <w:b/>
         </w:rPr>
-        <w:t xml:space="preserve">25.  5❤  </w:t>
+        <w:t xml:space="preserve">25.  4❤  </w:t>
       </w:r>
       <w:r>
         <w:rPr>
           <w:b/>
         </w:rPr>
-        <w:t>826351839j (@826351839j)</w:t>
-      </w:r>
-      <w:r>
-        <w:t xml:space="preserve">  ·  Liked by creator</w:t>
-      </w:r>
-      <w:r>
-        <w:t xml:space="preserve">  ·  2026-09-22 17:41</w:t>
+        <w:t>Tijana Devic (@tijana6290)</w:t>
+      </w:r>
+      <w:r>
+        <w:t xml:space="preserve">  ·  2026-09-22 17:56</w:t>
       </w:r>
     </w:p>
     <w:p>
@@ -730,7 +729,7 @@
         <w:ind w:left="283"/>
       </w:pPr>
       <w:r>
-        <w:t>da li si promenio misljenje o nekoj devojci, ili mozda i tari posle danasnjeg izazova? 🤔</w:t>
+        <w:t>Dali ti fali Tara</w:t>
       </w:r>
     </w:p>
     <w:p>
@@ -738,19 +737,16 @@
         <w:rPr>
           <w:b/>
         </w:rPr>
-        <w:t xml:space="preserve">26.  5❤  </w:t>
+        <w:t xml:space="preserve">26.  4❤  </w:t>
       </w:r>
       <w:r>
         <w:rPr>
           <w:b/>
         </w:rPr>
-        <w:t>jj (@jj73288)</w:t>
-      </w:r>
-      <w:r>
-        <w:t xml:space="preserve">  ·  Liked by creator</w:t>
-      </w:r>
-      <w:r>
-        <w:t xml:space="preserve">  ·  2026-09-22 17:52</w:t>
+        <w:t>☯️ (@msmsmsm002)</w:t>
+      </w:r>
+      <w:r>
+        <w:t xml:space="preserve">  ·  2026-09-22 19:21</w:t>
       </w:r>
     </w:p>
     <w:p>
@@ -759,7 +755,7 @@
         <w:ind w:left="283"/>
       </w:pPr>
       <w:r>
-        <w:t>Šta bi uradio drugačije da možeš opet da dođeš?</w:t>
+        <w:t>да ли је могуће да си изјавио да су момци бољи улов?</w:t>
       </w:r>
     </w:p>
     <w:p>
@@ -767,16 +763,16 @@
         <w:rPr>
           <w:b/>
         </w:rPr>
-        <w:t xml:space="preserve">27.  5❤  </w:t>
+        <w:t xml:space="preserve">27.  4❤  </w:t>
       </w:r>
       <w:r>
         <w:rPr>
           <w:b/>
         </w:rPr>
-        <w:t>Nikolina (@nikolina9481)</w:t>
-      </w:r>
-      <w:r>
-        <w:t xml:space="preserve">  ·  2026-09-22 18:45</w:t>
+        <w:t>🎭 (@n1i6n1a0)</w:t>
+      </w:r>
+      <w:r>
+        <w:t xml:space="preserve">  ·  2026-09-23 09:46</w:t>
       </w:r>
     </w:p>
     <w:p>
@@ -785,7 +781,7 @@
         <w:ind w:left="283"/>
       </w:pPr>
       <w:r>
-        <w:t>Da li ti nedostaje tara i koje je tvoje misljenje zato sto je luka ukrao od tebe</w:t>
+        <w:t>Da li si nasao unutra ljude sa kojima si kliknuo i da li ces imati kontakt sa njima kad izadu?</w:t>
       </w:r>
     </w:p>
     <w:p>
@@ -799,10 +795,10 @@
         <w:rPr>
           <w:b/>
         </w:rPr>
-        <w:t>Tijana Devic (@tijana6290)</w:t>
-      </w:r>
-      <w:r>
-        <w:t xml:space="preserve">  ·  2026-09-22 17:56</w:t>
+        <w:t>Neda🎀 (@nedaradosavljevic)</w:t>
+      </w:r>
+      <w:r>
+        <w:t xml:space="preserve">  ·  2026-09-23 11:39</w:t>
       </w:r>
     </w:p>
     <w:p>
@@ -811,7 +807,7 @@
         <w:ind w:left="283"/>
       </w:pPr>
       <w:r>
-        <w:t>Dali ti fali Tara</w:t>
+        <w:t>Da li ćeš da nastaviš da budeš sa Tarom posle takmičenja</w:t>
       </w:r>
     </w:p>
     <w:p>
@@ -819,16 +815,16 @@
         <w:rPr>
           <w:b/>
         </w:rPr>
-        <w:t xml:space="preserve">29.  4❤  </w:t>
+        <w:t xml:space="preserve">29.  3❤  </w:t>
       </w:r>
       <w:r>
         <w:rPr>
           <w:b/>
         </w:rPr>
-        <w:t>☯️ (@msmsmsm002)</w:t>
-      </w:r>
-      <w:r>
-        <w:t xml:space="preserve">  ·  2026-09-22 19:21</w:t>
+        <w:t>molim (@nakitumi.najsi)</w:t>
+      </w:r>
+      <w:r>
+        <w:t xml:space="preserve">  ·  2026-09-22 18:24</w:t>
       </w:r>
     </w:p>
     <w:p>
@@ -837,7 +833,7 @@
         <w:ind w:left="283"/>
       </w:pPr>
       <w:r>
-        <w:t>да ли је могуће да си изјавио да су момци бољи улов?</w:t>
+        <w:t>jel ti fali antoni</w:t>
       </w:r>
     </w:p>
     <w:p>
@@ -845,16 +841,19 @@
         <w:rPr>
           <w:b/>
         </w:rPr>
-        <w:t xml:space="preserve">30.  4❤  </w:t>
+        <w:t xml:space="preserve">30.  3❤  </w:t>
       </w:r>
       <w:r>
         <w:rPr>
           <w:b/>
         </w:rPr>
-        <w:t>🎭 (@n1i6n1a0)</w:t>
-      </w:r>
-      <w:r>
-        <w:t xml:space="preserve">  ·  2026-09-23 09:46</w:t>
+        <w:t>Suzana (@suzaaanaaa1)</w:t>
+      </w:r>
+      <w:r>
+        <w:t xml:space="preserve">  ·  Liked by creator</w:t>
+      </w:r>
+      <w:r>
+        <w:t xml:space="preserve">  ·  2026-09-22 18:40</w:t>
       </w:r>
     </w:p>
     <w:p>
@@ -863,7 +862,7 @@
         <w:ind w:left="283"/>
       </w:pPr>
       <w:r>
-        <w:t>Da li si nasao unutra ljude sa kojima si kliknuo i da li ces imati kontakt sa njima kad izadu?</w:t>
+        <w:t>da li ti se stvarno svidja Tara?</w:t>
       </w:r>
     </w:p>
     <w:p>
@@ -871,16 +870,16 @@
         <w:rPr>
           <w:b/>
         </w:rPr>
-        <w:t xml:space="preserve">31.  4❤  </w:t>
+        <w:t xml:space="preserve">31.  3❤  </w:t>
       </w:r>
       <w:r>
         <w:rPr>
           <w:b/>
         </w:rPr>
-        <w:t>Neda🎀 (@nedaradosavljevic)</w:t>
-      </w:r>
-      <w:r>
-        <w:t xml:space="preserve">  ·  2026-09-23 11:39</w:t>
+        <w:t>Walter (@noviicc0)</w:t>
+      </w:r>
+      <w:r>
+        <w:t xml:space="preserve">  ·  2026-09-22 20:46</w:t>
       </w:r>
     </w:p>
     <w:p>
@@ -889,7 +888,7 @@
         <w:ind w:left="283"/>
       </w:pPr>
       <w:r>
-        <w:t>Da li ćeš da nastaviš da budeš sa Tarom posle takmičenja</w:t>
+        <w:t>oces ju zapratit na insta i onda se druzit sa njom kad se vrati</w:t>
       </w:r>
     </w:p>
     <w:p>
@@ -903,13 +902,10 @@
         <w:rPr>
           <w:b/>
         </w:rPr>
-        <w:t>ℹ️va (@iva.b120)</w:t>
-      </w:r>
-      <w:r>
-        <w:t xml:space="preserve">  ·  Liked by creator</w:t>
-      </w:r>
-      <w:r>
-        <w:t xml:space="preserve">  ·  2026-09-22 17:15</w:t>
+        <w:t>Ditiriti_livesss🥱 (@dimelivess_)</w:t>
+      </w:r>
+      <w:r>
+        <w:t xml:space="preserve">  ·  2026-09-23 20:35</w:t>
       </w:r>
     </w:p>
     <w:p>
@@ -918,7 +914,7 @@
         <w:ind w:left="283"/>
       </w:pPr>
       <w:r>
-        <w:t>Šta su vvl braća rekli</w:t>
+        <w:t>moze follow molim te gledao sam love iland i slikao sam se sa tobom u piceriji i moja mama je drugarica sa tvojom nakboljom andjicom molim te brate</w:t>
       </w:r>
     </w:p>
     <w:p>
@@ -926,16 +922,16 @@
         <w:rPr>
           <w:b/>
         </w:rPr>
-        <w:t xml:space="preserve">33.  3❤  </w:t>
+        <w:t xml:space="preserve">33.  2❤  </w:t>
       </w:r>
       <w:r>
         <w:rPr>
           <w:b/>
         </w:rPr>
-        <w:t>molim (@nakitumi.najsi)</w:t>
-      </w:r>
-      <w:r>
-        <w:t xml:space="preserve">  ·  2026-09-22 18:24</w:t>
+        <w:t>Brina (@brinabudicc)</w:t>
+      </w:r>
+      <w:r>
+        <w:t xml:space="preserve">  ·  2026-09-22 17:40</w:t>
       </w:r>
     </w:p>
     <w:p>
@@ -944,7 +940,7 @@
         <w:ind w:left="283"/>
       </w:pPr>
       <w:r>
-        <w:t>jel ti fali antoni</w:t>
+        <w:t>Kako je sa produkcijom? Dali vam oni nareduju sta kazete kako se ponasati i fejkovane drame??</w:t>
       </w:r>
     </w:p>
     <w:p>
@@ -952,19 +948,16 @@
         <w:rPr>
           <w:b/>
         </w:rPr>
-        <w:t xml:space="preserve">34.  3❤  </w:t>
+        <w:t xml:space="preserve">34.  2❤  </w:t>
       </w:r>
       <w:r>
         <w:rPr>
           <w:b/>
         </w:rPr>
-        <w:t>Suzana (@suzaaanaaa1)</w:t>
-      </w:r>
-      <w:r>
-        <w:t xml:space="preserve">  ·  Liked by creator</w:t>
-      </w:r>
-      <w:r>
-        <w:t xml:space="preserve">  ·  2026-09-22 18:40</w:t>
+        <w:t>𝐿𝓊𝒸𝒾𝒶🦢 (@lucialovrin)</w:t>
+      </w:r>
+      <w:r>
+        <w:t xml:space="preserve">  ·  2026-09-22 19:32</w:t>
       </w:r>
     </w:p>
     <w:p>
@@ -973,7 +966,7 @@
         <w:ind w:left="283"/>
       </w:pPr>
       <w:r>
-        <w:t>da li ti se stvarno svidja Tara?</w:t>
+        <w:t>Kako se osecas sada kada si se vratio i video reakcije na neke izjave i situacije, dali je kao sto izgleda u epizodama i dali vam bombshellovi kazu sta se prica izvan vile?</w:t>
       </w:r>
     </w:p>
     <w:p>
@@ -981,16 +974,16 @@
         <w:rPr>
           <w:b/>
         </w:rPr>
-        <w:t xml:space="preserve">35.  3❤  </w:t>
+        <w:t xml:space="preserve">35.  2❤  </w:t>
       </w:r>
       <w:r>
         <w:rPr>
           <w:b/>
         </w:rPr>
-        <w:t>Walter (@noviicc0)</w:t>
-      </w:r>
-      <w:r>
-        <w:t xml:space="preserve">  ·  2026-09-22 20:46</w:t>
+        <w:t>mds0425 (@mds0425)</w:t>
+      </w:r>
+      <w:r>
+        <w:t xml:space="preserve">  ·  2026-09-22 19:40</w:t>
       </w:r>
     </w:p>
     <w:p>
@@ -999,7 +992,7 @@
         <w:ind w:left="283"/>
       </w:pPr>
       <w:r>
-        <w:t>oces ju zapratit na insta i onda se druzit sa njom kad se vrati</w:t>
+        <w:t>jel imas grajnder?</w:t>
       </w:r>
     </w:p>
     <w:p>
@@ -1007,16 +1000,16 @@
         <w:rPr>
           <w:b/>
         </w:rPr>
-        <w:t xml:space="preserve">36.  3❤  </w:t>
+        <w:t xml:space="preserve">36.  2❤  </w:t>
       </w:r>
       <w:r>
         <w:rPr>
           <w:b/>
         </w:rPr>
-        <w:t>Ditiriti_livesss🥱 (@dimelivess_)</w:t>
-      </w:r>
-      <w:r>
-        <w:t xml:space="preserve">  ·  2026-09-23 20:35</w:t>
+        <w:t>𝐅𝐢𝐥𝐢𝐩𝐨𝐯𝐢𝐜𝐜 (@sara.voli.macke)</w:t>
+      </w:r>
+      <w:r>
+        <w:t xml:space="preserve">  ·  2026-09-22 20:01</w:t>
       </w:r>
     </w:p>
     <w:p>
@@ -1025,7 +1018,7 @@
         <w:ind w:left="283"/>
       </w:pPr>
       <w:r>
-        <w:t>moze follow molim te gledao sam love iland i slikao sam se sa tobom u piceriji i moja mama je drugarica sa tvojom nakboljom andjicom molim te brate</w:t>
+        <w:t>sta je to love island</w:t>
       </w:r>
     </w:p>
     <w:p>
@@ -1039,10 +1032,10 @@
         <w:rPr>
           <w:b/>
         </w:rPr>
-        <w:t>Brina (@brinabudicc)</w:t>
-      </w:r>
-      <w:r>
-        <w:t xml:space="preserve">  ·  2026-09-22 17:40</w:t>
+        <w:t>jj (@jj73288)</w:t>
+      </w:r>
+      <w:r>
+        <w:t xml:space="preserve">  ·  2026-09-22 20:28</w:t>
       </w:r>
     </w:p>
     <w:p>
@@ -1051,7 +1044,7 @@
         <w:ind w:left="283"/>
       </w:pPr>
       <w:r>
-        <w:t>Kako je sa produkcijom? Dali vam oni nareduju sta kazete kako se ponasati i fejkovane drame??</w:t>
+        <w:t>Šta misliš o epizodi 8 i pocetak 9 ona tema koje je tvoje mišljenje</w:t>
       </w:r>
     </w:p>
     <w:p>
@@ -1065,10 +1058,10 @@
         <w:rPr>
           <w:b/>
         </w:rPr>
-        <w:t>𝐿𝓊𝒸𝒾𝒶🦢 (@lucialovrin)</w:t>
-      </w:r>
-      <w:r>
-        <w:t xml:space="preserve">  ·  2026-09-22 19:32</w:t>
+        <w:t>𝙪𝙣𝙖 𝙥𝙚𝙩𝙧𝙤𝙫𝙞ć (@unicka16_)</w:t>
+      </w:r>
+      <w:r>
+        <w:t xml:space="preserve">  ·  2026-09-24 14:55</w:t>
       </w:r>
     </w:p>
     <w:p>
@@ -1077,7 +1070,7 @@
         <w:ind w:left="283"/>
       </w:pPr>
       <w:r>
-        <w:t>Kako se osecas sada kada si se vratio i video reakcije na neke izjave i situacije, dali je kao sto izgleda u epizodama i dali vam bombshellovi kazu sta se prica izvan vile?</w:t>
+        <w:t>Da li ste smeli u nekim odvojenim prostorijama da pušite cigare, tereu ect. ili je to totalno bilo zabranjeno u vili?</w:t>
       </w:r>
     </w:p>
     <w:p>
@@ -1085,16 +1078,16 @@
         <w:rPr>
           <w:b/>
         </w:rPr>
-        <w:t xml:space="preserve">39.  2❤  </w:t>
+        <w:t xml:space="preserve">39.  1❤  </w:t>
       </w:r>
       <w:r>
         <w:rPr>
           <w:b/>
         </w:rPr>
-        <w:t>mds0425 (@mds0425)</w:t>
-      </w:r>
-      <w:r>
-        <w:t xml:space="preserve">  ·  2026-09-22 19:40</w:t>
+        <w:t>percijus (@percijus)</w:t>
+      </w:r>
+      <w:r>
+        <w:t xml:space="preserve">  ·  2026-09-22 19:17</w:t>
       </w:r>
     </w:p>
     <w:p>
@@ -1103,7 +1096,7 @@
         <w:ind w:left="283"/>
       </w:pPr>
       <w:r>
-        <w:t>jel imas grajnder?</w:t>
+        <w:t>Koji su tvoji stvarni utisci i kako si zapravo doziveo sve sto se desilo tamo?</w:t>
       </w:r>
     </w:p>
     <w:p>
@@ -1111,16 +1104,16 @@
         <w:rPr>
           <w:b/>
         </w:rPr>
-        <w:t xml:space="preserve">40.  2❤  </w:t>
+        <w:t xml:space="preserve">40.  1❤  </w:t>
       </w:r>
       <w:r>
         <w:rPr>
           <w:b/>
         </w:rPr>
-        <w:t>𝐅𝐢𝐥𝐢𝐩𝐨𝐯𝐢𝐜𝐜 (@sara.voli.macke)</w:t>
-      </w:r>
-      <w:r>
-        <w:t xml:space="preserve">  ·  2026-09-22 20:01</w:t>
+        <w:t>Anastaasijqq Kašikovićć (@anastasija.kasikovic)</w:t>
+      </w:r>
+      <w:r>
+        <w:t xml:space="preserve">  ·  2026-09-22 19:27</w:t>
       </w:r>
     </w:p>
     <w:p>
@@ -1129,7 +1122,7 @@
         <w:ind w:left="283"/>
       </w:pPr>
       <w:r>
-        <w:t>sta je to love island</w:t>
+        <w:t>Da li planiraš da se čujes sa Tarom???</w:t>
       </w:r>
     </w:p>
     <w:p>
@@ -1137,16 +1130,16 @@
         <w:rPr>
           <w:b/>
         </w:rPr>
-        <w:t xml:space="preserve">41.  2❤  </w:t>
+        <w:t xml:space="preserve">41.  1❤  </w:t>
       </w:r>
       <w:r>
         <w:rPr>
           <w:b/>
         </w:rPr>
-        <w:t>jj (@jj73288)</w:t>
-      </w:r>
-      <w:r>
-        <w:t xml:space="preserve">  ·  2026-09-22 20:28</w:t>
+        <w:t>Dunja Grozdanović (@dunja.groz)</w:t>
+      </w:r>
+      <w:r>
+        <w:t xml:space="preserve">  ·  2026-09-22 20:19</w:t>
       </w:r>
     </w:p>
     <w:p>
@@ -1155,7 +1148,7 @@
         <w:ind w:left="283"/>
       </w:pPr>
       <w:r>
-        <w:t>Šta misliš o epizodi 8 i pocetak 9 ona tema koje je tvoje mišljenje</w:t>
+        <w:t>Da li ces se javiti Tari posle kraja love islanda adrie?</w:t>
       </w:r>
     </w:p>
     <w:p>
@@ -1163,16 +1156,16 @@
         <w:rPr>
           <w:b/>
         </w:rPr>
-        <w:t xml:space="preserve">42.  2❤  </w:t>
+        <w:t xml:space="preserve">42.  1❤  </w:t>
       </w:r>
       <w:r>
         <w:rPr>
           <w:b/>
         </w:rPr>
-        <w:t>𝙪𝙣𝙖 𝙥𝙚𝙩𝙧𝙤𝙫𝙞ć (@unicka16_)</w:t>
-      </w:r>
-      <w:r>
-        <w:t xml:space="preserve">  ·  2026-09-24 14:55</w:t>
+        <w:t>aki💜 (@aki173233)</w:t>
+      </w:r>
+      <w:r>
+        <w:t xml:space="preserve">  ·  2026-09-23 05:35</w:t>
       </w:r>
     </w:p>
     <w:p>
@@ -1181,7 +1174,7 @@
         <w:ind w:left="283"/>
       </w:pPr>
       <w:r>
-        <w:t>Da li ste smeli u nekim odvojenim prostorijama da pušite cigare, tereu ect. ili je to totalno bilo zabranjeno u vili?</w:t>
+        <w:t>Koja slučajnost (ista pesma)</w:t>
       </w:r>
     </w:p>
     <w:p>
@@ -1195,10 +1188,10 @@
         <w:rPr>
           <w:b/>
         </w:rPr>
-        <w:t>Patko🤾 d⃠ (@patko365)</w:t>
-      </w:r>
-      <w:r>
-        <w:t xml:space="preserve">  ·  2026-09-22 17:46</w:t>
+        <w:t>bubisarba121 (@bubisarba121)</w:t>
+      </w:r>
+      <w:r>
+        <w:t xml:space="preserve">  ·  2026-09-23 09:19</w:t>
       </w:r>
     </w:p>
     <w:p>
@@ -1207,7 +1200,7 @@
         <w:ind w:left="283"/>
       </w:pPr>
       <w:r>
-        <w:t>oćeš opet da snimaš sa vvl brothers</w:t>
+        <w:t>Jesi dobro bato?</w:t>
       </w:r>
     </w:p>
     <w:p>
@@ -1221,10 +1214,10 @@
         <w:rPr>
           <w:b/>
         </w:rPr>
-        <w:t>percijus (@percijus)</w:t>
-      </w:r>
-      <w:r>
-        <w:t xml:space="preserve">  ·  2026-09-22 19:17</w:t>
+        <w:t>Nađa🪼 (@nackica345)</w:t>
+      </w:r>
+      <w:r>
+        <w:t xml:space="preserve">  ·  2026-09-24 10:25</w:t>
       </w:r>
     </w:p>
     <w:p>
@@ -1233,7 +1226,7 @@
         <w:ind w:left="283"/>
       </w:pPr>
       <w:r>
-        <w:t>Koji su tvoji stvarni utisci i kako si zapravo doziveo sve sto se desilo tamo?</w:t>
+        <w:t>da li ceš nakon takmicenja nastaviti da se vidjas sa tarom , čak iako se ne vratiš</w:t>
       </w:r>
     </w:p>
     <w:p>
@@ -1247,10 +1240,10 @@
         <w:rPr>
           <w:b/>
         </w:rPr>
-        <w:t>Anastaasijqq Kašikovićć (@anastasija.kasikovic)</w:t>
-      </w:r>
-      <w:r>
-        <w:t xml:space="preserve">  ·  2026-09-22 19:27</w:t>
+        <w:t>🪽 (@_djinnqa1_)</w:t>
+      </w:r>
+      <w:r>
+        <w:t xml:space="preserve">  ·  2026-09-25 10:37</w:t>
       </w:r>
     </w:p>
     <w:p>
@@ -1259,7 +1252,7 @@
         <w:ind w:left="283"/>
       </w:pPr>
       <w:r>
-        <w:t>Da li planiraš da se čujes sa Tarom???</w:t>
+        <w:t>Da li bih bio idalje sa Tarom kad se vrati iz vile?</w:t>
       </w:r>
     </w:p>
     <w:p>
@@ -1267,16 +1260,16 @@
         <w:rPr>
           <w:b/>
         </w:rPr>
-        <w:t xml:space="preserve">46.  1❤  </w:t>
+        <w:t xml:space="preserve">46.  0❤  </w:t>
       </w:r>
       <w:r>
         <w:rPr>
           <w:b/>
         </w:rPr>
-        <w:t>Dunja Grozdanović (@dunja.groz)</w:t>
-      </w:r>
-      <w:r>
-        <w:t xml:space="preserve">  ·  2026-09-22 20:19</w:t>
+        <w:t>nikola_panic (@nikola_panic0)</w:t>
+      </w:r>
+      <w:r>
+        <w:t xml:space="preserve">  ·  2026-09-22 19:23</w:t>
       </w:r>
     </w:p>
     <w:p>
@@ -1285,7 +1278,7 @@
         <w:ind w:left="283"/>
       </w:pPr>
       <w:r>
-        <w:t>Da li ces se javiti Tari posle kraja love islanda adrie?</w:t>
+        <w:t>da li ces ih posle pozvati na bleju</w:t>
       </w:r>
     </w:p>
     <w:p>
@@ -1293,16 +1286,16 @@
         <w:rPr>
           <w:b/>
         </w:rPr>
-        <w:t xml:space="preserve">47.  1❤  </w:t>
+        <w:t xml:space="preserve">47.  0❤  </w:t>
       </w:r>
       <w:r>
         <w:rPr>
           <w:b/>
         </w:rPr>
-        <w:t>aki💜 (@aki173233)</w:t>
-      </w:r>
-      <w:r>
-        <w:t xml:space="preserve">  ·  2026-09-23 05:35</w:t>
+        <w:t>🦊 (@_aajj4)</w:t>
+      </w:r>
+      <w:r>
+        <w:t xml:space="preserve">  ·  2026-09-22 19:25</w:t>
       </w:r>
     </w:p>
     <w:p>
@@ -1311,7 +1304,7 @@
         <w:ind w:left="283"/>
       </w:pPr>
       <w:r>
-        <w:t>Koja slučajnost (ista pesma)</w:t>
+        <w:t>Za koga sad navijaš? I ko nije isti van kamere i na kameri🤨</w:t>
       </w:r>
     </w:p>
     <w:p>
@@ -1319,16 +1312,16 @@
         <w:rPr>
           <w:b/>
         </w:rPr>
-        <w:t xml:space="preserve">48.  1❤  </w:t>
+        <w:t xml:space="preserve">48.  0❤  </w:t>
       </w:r>
       <w:r>
         <w:rPr>
           <w:b/>
         </w:rPr>
-        <w:t>bubisarba121 (@bubisarba121)</w:t>
-      </w:r>
-      <w:r>
-        <w:t xml:space="preserve">  ·  2026-09-23 09:19</w:t>
+        <w:t>Nadja🌸💗🌺 (@nadja1561)</w:t>
+      </w:r>
+      <w:r>
+        <w:t xml:space="preserve">  ·  2026-09-22 20:03</w:t>
       </w:r>
     </w:p>
     <w:p>
@@ -1337,7 +1330,7 @@
         <w:ind w:left="283"/>
       </w:pPr>
       <w:r>
-        <w:t>Jesi dobro bato?</w:t>
+        <w:t>Da li ti se svidela neka druga devojka sem tare</w:t>
       </w:r>
     </w:p>
     <w:p>
@@ -1345,16 +1338,16 @@
         <w:rPr>
           <w:b/>
         </w:rPr>
-        <w:t xml:space="preserve">49.  1❤  </w:t>
+        <w:t xml:space="preserve">49.  0❤  </w:t>
       </w:r>
       <w:r>
         <w:rPr>
           <w:b/>
         </w:rPr>
-        <w:t>⋆𐙚iluvlena𐙚⋆ (@lena_makarena20)</w:t>
-      </w:r>
-      <w:r>
-        <w:t xml:space="preserve">  ·  2026-09-23 12:05</w:t>
+        <w:t>sanja (@sanja2795)</w:t>
+      </w:r>
+      <w:r>
+        <w:t xml:space="preserve">  ·  2026-09-22 20:11</w:t>
       </w:r>
     </w:p>
     <w:p>
@@ -1363,7 +1356,7 @@
         <w:ind w:left="283"/>
       </w:pPr>
       <w:r>
-        <w:t>da li ces se vratiti u vvl brothers,i da li si gay?</w:t>
+        <w:t>Sta misliš o situaciji sa Mili i Gašperom i duplim standardima?</w:t>
       </w:r>
     </w:p>
     <w:p>
@@ -1371,16 +1364,16 @@
         <w:rPr>
           <w:b/>
         </w:rPr>
-        <w:t xml:space="preserve">50.  1❤  </w:t>
+        <w:t xml:space="preserve">50.  0❤  </w:t>
       </w:r>
       <w:r>
         <w:rPr>
           <w:b/>
         </w:rPr>
-        <w:t>Nađa🪼 (@nackica345)</w:t>
-      </w:r>
-      <w:r>
-        <w:t xml:space="preserve">  ·  2026-09-24 10:25</w:t>
+        <w:t>j (@jovanadrai7)</w:t>
+      </w:r>
+      <w:r>
+        <w:t xml:space="preserve">  ·  2026-09-22 20:12</w:t>
       </w:r>
     </w:p>
     <w:p>
@@ -1389,7 +1382,7 @@
         <w:ind w:left="283"/>
       </w:pPr>
       <w:r>
-        <w:t>da li ceš nakon takmicenja nastaviti da se vidjas sa tarom , čak iako se ne vratiš</w:t>
+        <w:t>Je l ti laknulo sto si otisao pre svega ovoga u osmoj epizodi ili bi branio zene?🫤</w:t>
       </w:r>
     </w:p>
     <w:p>
@@ -1397,16 +1390,16 @@
         <w:rPr>
           <w:b/>
         </w:rPr>
-        <w:t xml:space="preserve">51.  1❤  </w:t>
+        <w:t xml:space="preserve">51.  0❤  </w:t>
       </w:r>
       <w:r>
         <w:rPr>
           <w:b/>
         </w:rPr>
-        <w:t>𝓭𝓳𝓾𝓻𝓭𝓳𝓪 (@djjjjidjjjjji)</w:t>
-      </w:r>
-      <w:r>
-        <w:t xml:space="preserve">  ·  2026-09-25 08:52</w:t>
+        <w:t>Leenna (@nisina.pelica0)</w:t>
+      </w:r>
+      <w:r>
+        <w:t xml:space="preserve">  ·  2026-09-22 21:17</w:t>
       </w:r>
     </w:p>
     <w:p>
@@ -1415,7 +1408,9 @@
         <w:ind w:left="283"/>
       </w:pPr>
       <w:r>
-        <w:t>zasto nisi vise u vvl brothers</w:t>
+        <w:t>Da li ti ne doataje tara.</w:t>
+        <w:br/>
+        <w:t>Jasam se rasplakala kada sam videla taj deo i nisam mogla da stanem stvarno ste slatki🥺♥️</w:t>
       </w:r>
     </w:p>
     <w:p>
@@ -1423,16 +1418,16 @@
         <w:rPr>
           <w:b/>
         </w:rPr>
-        <w:t xml:space="preserve">52.  1❤  </w:t>
+        <w:t xml:space="preserve">52.  0❤  </w:t>
       </w:r>
       <w:r>
         <w:rPr>
           <w:b/>
         </w:rPr>
-        <w:t>🪽 (@_djinnqa1_)</w:t>
-      </w:r>
-      <w:r>
-        <w:t xml:space="preserve">  ·  2026-09-25 10:37</w:t>
+        <w:t>DjV11 (@djv116)</w:t>
+      </w:r>
+      <w:r>
+        <w:t xml:space="preserve">  ·  2026-09-22 21:49</w:t>
       </w:r>
     </w:p>
     <w:p>
@@ -1441,7 +1436,7 @@
         <w:ind w:left="283"/>
       </w:pPr>
       <w:r>
-        <w:t>Da li bih bio idalje sa Tarom kad se vrati iz vile?</w:t>
+        <w:t>zasto je anthony toliko plakao kad si otisao</w:t>
       </w:r>
     </w:p>
     <w:p>
@@ -1455,10 +1450,10 @@
         <w:rPr>
           <w:b/>
         </w:rPr>
-        <w:t>nikola_panic (@nikola_panic0)</w:t>
-      </w:r>
-      <w:r>
-        <w:t xml:space="preserve">  ·  2026-09-22 19:23</w:t>
+        <w:t>jaizopzpSnzuxix (@iajslzlxmjxhs)</w:t>
+      </w:r>
+      <w:r>
+        <w:t xml:space="preserve">  ·  2026-09-22 22:06</w:t>
       </w:r>
     </w:p>
     <w:p>
@@ -1467,7 +1462,7 @@
         <w:ind w:left="283"/>
       </w:pPr>
       <w:r>
-        <w:t>da li ces ih posle pozvati na bleju</w:t>
+        <w:t>Poruke podrske?</w:t>
       </w:r>
     </w:p>
     <w:p>
@@ -1481,10 +1476,10 @@
         <w:rPr>
           <w:b/>
         </w:rPr>
-        <w:t>🦊 (@_aajj4)</w:t>
-      </w:r>
-      <w:r>
-        <w:t xml:space="preserve">  ·  2026-09-22 19:25</w:t>
+        <w:t>bengi (@benger553)</w:t>
+      </w:r>
+      <w:r>
+        <w:t xml:space="preserve">  ·  2026-09-22 23:04</w:t>
       </w:r>
     </w:p>
     <w:p>
@@ -1493,7 +1488,7 @@
         <w:ind w:left="283"/>
       </w:pPr>
       <w:r>
-        <w:t>Za koga sad navijaš? I ko nije isti van kamere i na kameri🤨</w:t>
+        <w:t>kako to da si tetovirao brand of sacrifice od berserka</w:t>
       </w:r>
     </w:p>
     <w:p>
@@ -1507,10 +1502,10 @@
         <w:rPr>
           <w:b/>
         </w:rPr>
-        <w:t>Nadja🌸💗🌺 (@nadja1561)</w:t>
-      </w:r>
-      <w:r>
-        <w:t xml:space="preserve">  ·  2026-09-22 20:03</w:t>
+        <w:t>trunkszr (@markoeur)</w:t>
+      </w:r>
+      <w:r>
+        <w:t xml:space="preserve">  ·  2026-09-22 23:18</w:t>
       </w:r>
     </w:p>
     <w:p>
@@ -1519,7 +1514,9 @@
         <w:ind w:left="283"/>
       </w:pPr>
       <w:r>
-        <w:t>Da li ti se svidela neka druga devojka sem tare</w:t>
+        <w:t>sto kapa brate 🤣</w:t>
+        <w:br/>
+        <w:t>dobar si momak nema sta ☺️</w:t>
       </w:r>
     </w:p>
     <w:p>
@@ -1533,10 +1530,10 @@
         <w:rPr>
           <w:b/>
         </w:rPr>
-        <w:t>sanja (@sanja2795)</w:t>
-      </w:r>
-      <w:r>
-        <w:t xml:space="preserve">  ·  2026-09-22 20:11</w:t>
+        <w:t>444 (@444.ip)</w:t>
+      </w:r>
+      <w:r>
+        <w:t xml:space="preserve">  ·  2026-09-23 01:47</w:t>
       </w:r>
     </w:p>
     <w:p>
@@ -1545,7 +1542,7 @@
         <w:ind w:left="283"/>
       </w:pPr>
       <w:r>
-        <w:t>Sta misliš o situaciji sa Mili i Gašperom i duplim standardima?</w:t>
+        <w:t>Kad si skuzio da si gay?</w:t>
       </w:r>
     </w:p>
     <w:p>
@@ -1559,10 +1556,10 @@
         <w:rPr>
           <w:b/>
         </w:rPr>
-        <w:t>j (@jovanadrai7)</w:t>
-      </w:r>
-      <w:r>
-        <w:t xml:space="preserve">  ·  2026-09-22 20:12</w:t>
+        <w:t>" (@whit3n1ght)</w:t>
+      </w:r>
+      <w:r>
+        <w:t xml:space="preserve">  ·  2026-09-23 08:58</w:t>
       </w:r>
     </w:p>
     <w:p>
@@ -1571,7 +1568,7 @@
         <w:ind w:left="283"/>
       </w:pPr>
       <w:r>
-        <w:t>Je l ti laknulo sto si otisao pre svega ovoga u osmoj epizodi ili bi branio zene?🫤</w:t>
+        <w:t>sta ste rucali i da li ste zajedno ili kako je ko hteo?</w:t>
       </w:r>
     </w:p>
     <w:p>
@@ -1585,10 +1582,10 @@
         <w:rPr>
           <w:b/>
         </w:rPr>
-        <w:t>Leenna (@nisina.pelica0)</w:t>
-      </w:r>
-      <w:r>
-        <w:t xml:space="preserve">  ·  2026-09-22 21:17</w:t>
+        <w:t>🏍️ZOKA (@zoka4344)</w:t>
+      </w:r>
+      <w:r>
+        <w:t xml:space="preserve">  ·  2026-09-23 09:24</w:t>
       </w:r>
     </w:p>
     <w:p>
@@ -1597,9 +1594,7 @@
         <w:ind w:left="283"/>
       </w:pPr>
       <w:r>
-        <w:t>Da li ti ne doataje tara.</w:t>
-        <w:br/>
-        <w:t>Jasam se rasplakala kada sam videla taj deo i nisam mogla da stanem stvarno ste slatki🥺♥️</w:t>
+        <w:t>Da li se Lara ponaša isto kao na snimku na TV u stvari ili ne u smislu kad vas kamere ne snimaju</w:t>
       </w:r>
     </w:p>
     <w:p>
@@ -1613,10 +1608,10 @@
         <w:rPr>
           <w:b/>
         </w:rPr>
-        <w:t>DjV11 (@djv116)</w:t>
-      </w:r>
-      <w:r>
-        <w:t xml:space="preserve">  ·  2026-09-22 21:49</w:t>
+        <w:t>mmadino (@mmadino5)</w:t>
+      </w:r>
+      <w:r>
+        <w:t xml:space="preserve">  ·  2026-09-23 11:24</w:t>
       </w:r>
     </w:p>
     <w:p>
@@ -1625,7 +1620,7 @@
         <w:ind w:left="283"/>
       </w:pPr>
       <w:r>
-        <w:t>zasto je anthony toliko plakao kad si otisao</w:t>
+        <w:t>os ic i nagodinu?😂</w:t>
       </w:r>
     </w:p>
     <w:p>
@@ -1639,10 +1634,10 @@
         <w:rPr>
           <w:b/>
         </w:rPr>
-        <w:t>jaizopzpSnzuxix (@iajslzlxmjxhs)</w:t>
-      </w:r>
-      <w:r>
-        <w:t xml:space="preserve">  ·  2026-09-22 22:06</w:t>
+        <w:t>yovana (@jovanasaponjic)</w:t>
+      </w:r>
+      <w:r>
+        <w:t xml:space="preserve">  ·  2026-09-23 11:25</w:t>
       </w:r>
     </w:p>
     <w:p>
@@ -1651,7 +1646,7 @@
         <w:ind w:left="283"/>
       </w:pPr>
       <w:r>
-        <w:t>Poruke podrske?</w:t>
+        <w:t>da li ces idalje gkedati live iland</w:t>
       </w:r>
     </w:p>
     <w:p>
@@ -1665,10 +1660,10 @@
         <w:rPr>
           <w:b/>
         </w:rPr>
-        <w:t>bengi (@benger553)</w:t>
-      </w:r>
-      <w:r>
-        <w:t xml:space="preserve">  ·  2026-09-22 23:04</w:t>
+        <w:t>Inesss (@martinacigvan1)</w:t>
+      </w:r>
+      <w:r>
+        <w:t xml:space="preserve">  ·  2026-09-23 13:49</w:t>
       </w:r>
     </w:p>
     <w:p>
@@ -1677,7 +1672,7 @@
         <w:ind w:left="283"/>
       </w:pPr>
       <w:r>
-        <w:t>kako to da si tetovirao brand of sacrifice od berserka</w:t>
+        <w:t>jel jos love alend adrija jos se snima da ili ne</w:t>
       </w:r>
     </w:p>
     <w:p>
@@ -1691,10 +1686,10 @@
         <w:rPr>
           <w:b/>
         </w:rPr>
-        <w:t>trunkszr (@markoeur)</w:t>
-      </w:r>
-      <w:r>
-        <w:t xml:space="preserve">  ·  2026-09-22 23:18</w:t>
+        <w:t>tena? (@tena_0602)</w:t>
+      </w:r>
+      <w:r>
+        <w:t xml:space="preserve">  ·  2026-09-23 14:00</w:t>
       </w:r>
     </w:p>
     <w:p>
@@ -1703,9 +1698,7 @@
         <w:ind w:left="283"/>
       </w:pPr>
       <w:r>
-        <w:t>sto kapa brate 🤣</w:t>
-        <w:br/>
-        <w:t>dobar si momak nema sta ☺️</w:t>
+        <w:t>Jesi ti svjestan koliko smo svi plakali zbog tebeeee</w:t>
       </w:r>
     </w:p>
     <w:p>
@@ -1719,10 +1712,10 @@
         <w:rPr>
           <w:b/>
         </w:rPr>
-        <w:t>444 (@444.ip)</w:t>
-      </w:r>
-      <w:r>
-        <w:t xml:space="preserve">  ·  2026-09-23 01:47</w:t>
+        <w:t>zivot (@zivot304)</w:t>
+      </w:r>
+      <w:r>
+        <w:t xml:space="preserve">  ·  2026-09-23 14:26</w:t>
       </w:r>
     </w:p>
     <w:p>
@@ -1731,7 +1724,7 @@
         <w:ind w:left="283"/>
       </w:pPr>
       <w:r>
-        <w:t>Kad si skuzio da si gay?</w:t>
+        <w:t>Jel moguce da se vratis ikako?</w:t>
       </w:r>
     </w:p>
     <w:p>
@@ -1745,10 +1738,10 @@
         <w:rPr>
           <w:b/>
         </w:rPr>
-        <w:t>" (@whit3n1ght)</w:t>
-      </w:r>
-      <w:r>
-        <w:t xml:space="preserve">  ·  2026-09-23 08:58</w:t>
+        <w:t>💜 (@jovanovicm07)</w:t>
+      </w:r>
+      <w:r>
+        <w:t xml:space="preserve">  ·  2026-09-23 14:32</w:t>
       </w:r>
     </w:p>
     <w:p>
@@ -1757,7 +1750,7 @@
         <w:ind w:left="283"/>
       </w:pPr>
       <w:r>
-        <w:t>sta ste rucali i da li ste zajedno ili kako je ko hteo?</w:t>
+        <w:t>Jel se to još uvek snima ili se to već snimilo?</w:t>
       </w:r>
     </w:p>
     <w:p>
@@ -1771,10 +1764,10 @@
         <w:rPr>
           <w:b/>
         </w:rPr>
-        <w:t>🏍️ZOKA (@zoka4344)</w:t>
-      </w:r>
-      <w:r>
-        <w:t xml:space="preserve">  ·  2026-09-23 09:24</w:t>
+        <w:t>pveljkovic21 (@pveljkovic21_)</w:t>
+      </w:r>
+      <w:r>
+        <w:t xml:space="preserve">  ·  2026-09-23 17:14</w:t>
       </w:r>
     </w:p>
     <w:p>
@@ -1783,7 +1776,7 @@
         <w:ind w:left="283"/>
       </w:pPr>
       <w:r>
-        <w:t>Da li se Lara ponaša isto kao na snimku na TV u stvari ili ne u smislu kad vas kamere ne snimaju</w:t>
+        <w:t>jel namesteno sve?</w:t>
       </w:r>
     </w:p>
     <w:p>
@@ -1797,10 +1790,10 @@
         <w:rPr>
           <w:b/>
         </w:rPr>
-        <w:t>mmadino (@mmadino5)</w:t>
-      </w:r>
-      <w:r>
-        <w:t xml:space="preserve">  ·  2026-09-23 11:24</w:t>
+        <w:t>JB (@b__janaa)</w:t>
+      </w:r>
+      <w:r>
+        <w:t xml:space="preserve">  ·  2026-09-23 17:21</w:t>
       </w:r>
     </w:p>
     <w:p>
@@ -1809,7 +1802,7 @@
         <w:ind w:left="283"/>
       </w:pPr>
       <w:r>
-        <w:t>os ic i nagodinu?😂</w:t>
+        <w:t>Ko ti je najprivlacniji ? I zasto je to Anthony 😂</w:t>
       </w:r>
     </w:p>
     <w:p>
@@ -1823,10 +1816,10 @@
         <w:rPr>
           <w:b/>
         </w:rPr>
-        <w:t>yovana (@jovanasaponjic)</w:t>
-      </w:r>
-      <w:r>
-        <w:t xml:space="preserve">  ·  2026-09-23 11:25</w:t>
+        <w:t>☆Callmemajmune☆ (@sofijazindovic3)</w:t>
+      </w:r>
+      <w:r>
+        <w:t xml:space="preserve">  ·  2026-09-23 19:09</w:t>
       </w:r>
     </w:p>
     <w:p>
@@ -1835,7 +1828,7 @@
         <w:ind w:left="283"/>
       </w:pPr>
       <w:r>
-        <w:t>da li ces idalje gkedati live iland</w:t>
+        <w:t>Da li jer režija pravila karaktere od ljudi i da li su bili drugačiji van kamemere ?</w:t>
       </w:r>
     </w:p>
     <w:p>
@@ -1849,10 +1842,10 @@
         <w:rPr>
           <w:b/>
         </w:rPr>
-        <w:t>милетић (@vasilije681)</w:t>
-      </w:r>
-      <w:r>
-        <w:t xml:space="preserve">  ·  2026-09-23 11:40</w:t>
+        <w:t>sofijapetrovic (@sofijapetrovicp)</w:t>
+      </w:r>
+      <w:r>
+        <w:t xml:space="preserve">  ·  2026-09-23 19:59</w:t>
       </w:r>
     </w:p>
     <w:p>
@@ -1861,7 +1854,7 @@
         <w:ind w:left="283"/>
       </w:pPr>
       <w:r>
-        <w:t>Comeback vvl brothers??</w:t>
+        <w:t>Da li postoji mogucnost da te vrate, da li postoji takvo pravilo uopste?</w:t>
       </w:r>
     </w:p>
     <w:p>
@@ -1875,10 +1868,10 @@
         <w:rPr>
           <w:b/>
         </w:rPr>
-        <w:t>Juca (@jucaac1)</w:t>
-      </w:r>
-      <w:r>
-        <w:t xml:space="preserve">  ·  2026-09-23 12:14</w:t>
+        <w:t>Maksim (@maksim023pro)</w:t>
+      </w:r>
+      <w:r>
+        <w:t xml:space="preserve">  ·  2026-09-23 21:04</w:t>
       </w:r>
     </w:p>
     <w:p>
@@ -1887,7 +1880,7 @@
         <w:ind w:left="283"/>
       </w:pPr>
       <w:r>
-        <w:t>Da li ćeš se vratiti u vvl brother</w:t>
+        <w:t>kako si podneo prelazak sa 30+ stepeni na 10 u zrenjaninu</w:t>
       </w:r>
     </w:p>
     <w:p>
@@ -1901,10 +1894,10 @@
         <w:rPr>
           <w:b/>
         </w:rPr>
-        <w:t>Mxx@_official (@mihajlo68920)</w:t>
-      </w:r>
-      <w:r>
-        <w:t xml:space="preserve">  ·  2026-09-23 13:39</w:t>
+        <w:t>akiii🫶🏽🫶🏽🫶🏽 (@akikawqsqki)</w:t>
+      </w:r>
+      <w:r>
+        <w:t xml:space="preserve">  ·  2026-09-24 08:04</w:t>
       </w:r>
     </w:p>
     <w:p>
@@ -1913,7 +1906,7 @@
         <w:ind w:left="283"/>
       </w:pPr>
       <w:r>
-        <w:t>oćeš se vratiti u vvl brothers</w:t>
+        <w:t>da li ti se jos uvek svidja Tara i da li hoces posle opet da budete zajedno?</w:t>
       </w:r>
     </w:p>
     <w:p>
@@ -1927,10 +1920,10 @@
         <w:rPr>
           <w:b/>
         </w:rPr>
-        <w:t>Inesss (@martinacigvan1)</w:t>
-      </w:r>
-      <w:r>
-        <w:t xml:space="preserve">  ·  2026-09-23 13:49</w:t>
+        <w:t>ssurlqn❤️‍🩹 (@ssurlqn)</w:t>
+      </w:r>
+      <w:r>
+        <w:t xml:space="preserve">  ·  2026-09-24 14:32</w:t>
       </w:r>
     </w:p>
     <w:p>
@@ -1939,7 +1932,7 @@
         <w:ind w:left="283"/>
       </w:pPr>
       <w:r>
-        <w:t>jel jos love alend adrija jos se snima da ili ne</w:t>
+        <w:t>vec nam nedostajes jako🥺prvi ispao a bio si najbolji🫶🏼inace namjeravas li uci i u drugu s?</w:t>
       </w:r>
     </w:p>
     <w:p>
@@ -1953,10 +1946,10 @@
         <w:rPr>
           <w:b/>
         </w:rPr>
-        <w:t>tena? (@tena_0602)</w:t>
-      </w:r>
-      <w:r>
-        <w:t xml:space="preserve">  ·  2026-09-23 14:00</w:t>
+        <w:t>Dorotea Montresor (@dorotea.montresor)</w:t>
+      </w:r>
+      <w:r>
+        <w:t xml:space="preserve">  ·  2026-09-24 18:28</w:t>
       </w:r>
     </w:p>
     <w:p>
@@ -1965,7 +1958,7 @@
         <w:ind w:left="283"/>
       </w:pPr>
       <w:r>
-        <w:t>Jesi ti svjestan koliko smo svi plakali zbog tebeeee</w:t>
+        <w:t>ces biti sa tarom</w:t>
       </w:r>
     </w:p>
     <w:p>
@@ -1979,10 +1972,10 @@
         <w:rPr>
           <w:b/>
         </w:rPr>
-        <w:t>zivot (@zivot304)</w:t>
-      </w:r>
-      <w:r>
-        <w:t xml:space="preserve">  ·  2026-09-23 14:26</w:t>
+        <w:t>neda.radiv (@neda.radiv)</w:t>
+      </w:r>
+      <w:r>
+        <w:t xml:space="preserve">  ·  2026-09-24 18:53</w:t>
       </w:r>
     </w:p>
     <w:p>
@@ -1991,7 +1984,7 @@
         <w:ind w:left="283"/>
       </w:pPr>
       <w:r>
-        <w:t>Jel moguce da se vratis ikako?</w:t>
+        <w:t>Što nisi pito Taru za instagram</w:t>
       </w:r>
     </w:p>
     <w:p>
@@ -2005,10 +1998,10 @@
         <w:rPr>
           <w:b/>
         </w:rPr>
-        <w:t>💜 (@jovanovicm07)</w:t>
-      </w:r>
-      <w:r>
-        <w:t xml:space="preserve">  ·  2026-09-23 14:32</w:t>
+        <w:t>Lana 🧸ྀི (@lana.mitrovi)</w:t>
+      </w:r>
+      <w:r>
+        <w:t xml:space="preserve">  ·  2026-09-24 19:36</w:t>
       </w:r>
     </w:p>
     <w:p>
@@ -2017,7 +2010,7 @@
         <w:ind w:left="283"/>
       </w:pPr>
       <w:r>
-        <w:t>Jel se to još uvek snima ili se to već snimilo?</w:t>
+        <w:t>Da li ćemo da dobijemo reunion našeg najslađeg para nakon Tarinog ispadanja</w:t>
       </w:r>
     </w:p>
     <w:p>
@@ -2031,10 +2024,10 @@
         <w:rPr>
           <w:b/>
         </w:rPr>
-        <w:t>Гробари Југ (@petarradisavljevi3)</w:t>
-      </w:r>
-      <w:r>
-        <w:t xml:space="preserve">  ·  2026-09-23 17:01</w:t>
+        <w:t>♡𓆉𝐓𝐨𝐜𝐚_𝐇𝐞𝐥𝐢♡𓆉 (@helenicamegan)</w:t>
+      </w:r>
+      <w:r>
+        <w:t xml:space="preserve">  ·  2026-09-24 19:50</w:t>
       </w:r>
     </w:p>
     <w:p>
@@ -2043,7 +2036,7 @@
         <w:ind w:left="283"/>
       </w:pPr>
       <w:r>
-        <w:t>dali će se vratiti vvl brothers?</w:t>
+        <w:t>kakva je tamo ishrana?</w:t>
       </w:r>
     </w:p>
     <w:p>
@@ -2057,10 +2050,10 @@
         <w:rPr>
           <w:b/>
         </w:rPr>
-        <w:t>pveljkovic21 (@pveljkovic21_)</w:t>
-      </w:r>
-      <w:r>
-        <w:t xml:space="preserve">  ·  2026-09-23 17:14</w:t>
+        <w:t>🦕eon (@leonkristo)</w:t>
+      </w:r>
+      <w:r>
+        <w:t xml:space="preserve">  ·  2026-09-24 19:59</w:t>
       </w:r>
     </w:p>
     <w:p>
@@ -2069,7 +2062,7 @@
         <w:ind w:left="283"/>
       </w:pPr>
       <w:r>
-        <w:t>jel namesteno sve?</w:t>
+        <w:t>sta ste sve imali na vasim telefonima</w:t>
       </w:r>
     </w:p>
     <w:p>
@@ -2083,10 +2076,10 @@
         <w:rPr>
           <w:b/>
         </w:rPr>
-        <w:t>JB (@b__janaa)</w:t>
-      </w:r>
-      <w:r>
-        <w:t xml:space="preserve">  ·  2026-09-23 17:21</w:t>
+        <w:t>laranikolic (@laraniikolic)</w:t>
+      </w:r>
+      <w:r>
+        <w:t xml:space="preserve">  ·  2026-09-24 22:49</w:t>
       </w:r>
     </w:p>
     <w:p>
@@ -2095,7 +2088,7 @@
         <w:ind w:left="283"/>
       </w:pPr>
       <w:r>
-        <w:t>Ko ti je najprivlacniji ? I zasto je to Anthony 😂</w:t>
+        <w:t>Tara je ispala iz love islanda,da li planirate susret?</w:t>
       </w:r>
     </w:p>
     <w:p>
@@ -2109,10 +2102,10 @@
         <w:rPr>
           <w:b/>
         </w:rPr>
-        <w:t>☆Callmemajmune☆ (@sofijazindovic3)</w:t>
-      </w:r>
-      <w:r>
-        <w:t xml:space="preserve">  ·  2026-09-23 19:09</w:t>
+        <w:t>Branko (@usermamrr)</w:t>
+      </w:r>
+      <w:r>
+        <w:t xml:space="preserve">  ·  2026-09-24 22:51</w:t>
       </w:r>
     </w:p>
     <w:p>
@@ -2121,7 +2114,7 @@
         <w:ind w:left="283"/>
       </w:pPr>
       <w:r>
-        <w:t>Da li jer režija pravila karaktere od ljudi i da li su bili drugačiji van kamemere ?</w:t>
+        <w:t>oces li taru zvat vani sad kad je izašla iz vile?</w:t>
       </w:r>
     </w:p>
     <w:p>
@@ -2135,10 +2128,10 @@
         <w:rPr>
           <w:b/>
         </w:rPr>
-        <w:t>sofijapetrovic (@sofijapetrovicp)</w:t>
-      </w:r>
-      <w:r>
-        <w:t xml:space="preserve">  ·  2026-09-23 19:59</w:t>
+        <w:t>Sanja Shalom (@sanjaraphaellahannaelle)</w:t>
+      </w:r>
+      <w:r>
+        <w:t xml:space="preserve">  ·  2026-09-24 22:52</w:t>
       </w:r>
     </w:p>
     <w:p>
@@ -2147,7 +2140,7 @@
         <w:ind w:left="283"/>
       </w:pPr>
       <w:r>
-        <w:t>Da li postoji mogucnost da te vrate, da li postoji takvo pravilo uopste?</w:t>
+        <w:t>Hoćeš li se videti sa Tarom sad 🥰</w:t>
       </w:r>
     </w:p>
     <w:p>
@@ -2161,10 +2154,10 @@
         <w:rPr>
           <w:b/>
         </w:rPr>
-        <w:t>Maksim (@maksim023pro)</w:t>
-      </w:r>
-      <w:r>
-        <w:t xml:space="preserve">  ·  2026-09-23 21:04</w:t>
+        <w:t>brtttttdvvvu (@brtttttdvvvu)</w:t>
+      </w:r>
+      <w:r>
+        <w:t xml:space="preserve">  ·  2026-09-25 00:30</w:t>
       </w:r>
     </w:p>
     <w:p>
@@ -2173,7 +2166,7 @@
         <w:ind w:left="283"/>
       </w:pPr>
       <w:r>
-        <w:t>kako si podneo prelazak sa 30+ stepeni na 10 u zrenjaninu</w:t>
+        <w:t>Dali ces Pokušat opet biti sa tarom u rl ?</w:t>
       </w:r>
     </w:p>
     <w:p>
@@ -2187,10 +2180,10 @@
         <w:rPr>
           <w:b/>
         </w:rPr>
-        <w:t>akiii🫶🏽🫶🏽🫶🏽 (@akikawqsqki)</w:t>
-      </w:r>
-      <w:r>
-        <w:t xml:space="preserve">  ·  2026-09-24 08:04</w:t>
+        <w:t>N🩷 (@nedzla.c)</w:t>
+      </w:r>
+      <w:r>
+        <w:t xml:space="preserve">  ·  2026-09-25 06:05</w:t>
       </w:r>
     </w:p>
     <w:p>
@@ -2199,7 +2192,7 @@
         <w:ind w:left="283"/>
       </w:pPr>
       <w:r>
-        <w:t>da li ti se jos uvek svidja Tara i da li hoces posle opet da budete zajedno?</w:t>
+        <w:t>jesi razdelio broj ili tik tok sa momcima I devojkama</w:t>
       </w:r>
     </w:p>
     <w:p>
@@ -2213,10 +2206,10 @@
         <w:rPr>
           <w:b/>
         </w:rPr>
-        <w:t>ssurlqn❤️‍🩹 (@ssurlqn)</w:t>
-      </w:r>
-      <w:r>
-        <w:t xml:space="preserve">  ·  2026-09-24 14:32</w:t>
+        <w:t>𝔏𝔞𝔫𝔞 (@ichh_lanaa)</w:t>
+      </w:r>
+      <w:r>
+        <w:t xml:space="preserve">  ·  2026-09-25 09:01</w:t>
       </w:r>
     </w:p>
     <w:p>
@@ -2225,7 +2218,7 @@
         <w:ind w:left="283"/>
       </w:pPr>
       <w:r>
-        <w:t>vec nam nedostajes jako🥺prvi ispao a bio si najbolji🫶🏼inace namjeravas li uci i u drugu s?</w:t>
+        <w:t>Jel ce se spojis sa tarom van love island??</w:t>
       </w:r>
     </w:p>
     <w:p>
@@ -2239,10 +2232,10 @@
         <w:rPr>
           <w:b/>
         </w:rPr>
-        <w:t>Toma (@tomanovic_66)</w:t>
-      </w:r>
-      <w:r>
-        <w:t xml:space="preserve">  ·  2026-09-24 17:57</w:t>
+        <w:t>Ena!🌸🩷 &gt;_&lt; (NO1 NAJIMI FAN) (@tvoja.lokalna.ena)</w:t>
+      </w:r>
+      <w:r>
+        <w:t xml:space="preserve">  ·  2026-09-25 13:24</w:t>
       </w:r>
     </w:p>
     <w:p>
@@ -2251,7 +2244,7 @@
         <w:ind w:left="283"/>
       </w:pPr>
       <w:r>
-        <w:t>sto si napustio vvl brothers</w:t>
+        <w:t>OBOŽAVAMO TE VUKAŠINEE BIO SI NAJBOLJIII❤️kao anime fan,koja ti je omiljena anime???</w:t>
       </w:r>
     </w:p>
     <w:p>
@@ -2265,10 +2258,10 @@
         <w:rPr>
           <w:b/>
         </w:rPr>
-        <w:t>Dorotea Montresor (@dorotea.montresor)</w:t>
-      </w:r>
-      <w:r>
-        <w:t xml:space="preserve">  ·  2026-09-24 18:28</w:t>
+        <w:t>mira (@mira42917)</w:t>
+      </w:r>
+      <w:r>
+        <w:t xml:space="preserve">  ·  2026-09-25 14:21</w:t>
       </w:r>
     </w:p>
     <w:p>
@@ -2277,345 +2270,7 @@
         <w:ind w:left="283"/>
       </w:pPr>
       <w:r>
-        <w:t>ces biti sa tarom</w:t>
-      </w:r>
-    </w:p>
-    <w:p>
-      <w:r>
-        <w:rPr>
-          <w:b/>
-        </w:rPr>
-        <w:t xml:space="preserve">85.  0❤  </w:t>
-      </w:r>
-      <w:r>
-        <w:rPr>
-          <w:b/>
-        </w:rPr>
-        <w:t>neda.radiv (@neda.radiv)</w:t>
-      </w:r>
-      <w:r>
-        <w:t xml:space="preserve">  ·  2026-09-24 18:53</w:t>
-      </w:r>
-    </w:p>
-    <w:p>
-      <w:pPr>
-        <w:spacing w:after="160"/>
-        <w:ind w:left="283"/>
-      </w:pPr>
-      <w:r>
-        <w:t>Što nisi pito Taru za instagram</w:t>
-      </w:r>
-    </w:p>
-    <w:p>
-      <w:r>
-        <w:rPr>
-          <w:b/>
-        </w:rPr>
-        <w:t xml:space="preserve">86.  0❤  </w:t>
-      </w:r>
-      <w:r>
-        <w:rPr>
-          <w:b/>
-        </w:rPr>
-        <w:t>Lana 🧸ྀི (@lana.mitrovi)</w:t>
-      </w:r>
-      <w:r>
-        <w:t xml:space="preserve">  ·  2026-09-24 19:36</w:t>
-      </w:r>
-    </w:p>
-    <w:p>
-      <w:pPr>
-        <w:spacing w:after="160"/>
-        <w:ind w:left="283"/>
-      </w:pPr>
-      <w:r>
-        <w:t>Da li ćemo da dobijemo reunion našeg najslađeg para nakon Tarinog ispadanja</w:t>
-      </w:r>
-    </w:p>
-    <w:p>
-      <w:r>
-        <w:rPr>
-          <w:b/>
-        </w:rPr>
-        <w:t xml:space="preserve">87.  0❤  </w:t>
-      </w:r>
-      <w:r>
-        <w:rPr>
-          <w:b/>
-        </w:rPr>
-        <w:t>♡𓆉𝐓𝐨𝐜𝐚_𝐇𝐞𝐥𝐢♡𓆉 (@helenicamegan)</w:t>
-      </w:r>
-      <w:r>
-        <w:t xml:space="preserve">  ·  2026-09-24 19:50</w:t>
-      </w:r>
-    </w:p>
-    <w:p>
-      <w:pPr>
-        <w:spacing w:after="160"/>
-        <w:ind w:left="283"/>
-      </w:pPr>
-      <w:r>
-        <w:t>kakva je tamo ishrana?</w:t>
-      </w:r>
-    </w:p>
-    <w:p>
-      <w:r>
-        <w:rPr>
-          <w:b/>
-        </w:rPr>
-        <w:t xml:space="preserve">88.  0❤  </w:t>
-      </w:r>
-      <w:r>
-        <w:rPr>
-          <w:b/>
-        </w:rPr>
-        <w:t>🦕eon (@leonkristo)</w:t>
-      </w:r>
-      <w:r>
-        <w:t xml:space="preserve">  ·  2026-09-24 19:59</w:t>
-      </w:r>
-    </w:p>
-    <w:p>
-      <w:pPr>
-        <w:spacing w:after="160"/>
-        <w:ind w:left="283"/>
-      </w:pPr>
-      <w:r>
-        <w:t>sta ste sve imali na vasim telefonima</w:t>
-      </w:r>
-    </w:p>
-    <w:p>
-      <w:r>
-        <w:rPr>
-          <w:b/>
-        </w:rPr>
-        <w:t xml:space="preserve">89.  0❤  </w:t>
-      </w:r>
-      <w:r>
-        <w:rPr>
-          <w:b/>
-        </w:rPr>
-        <w:t>laranikolic (@laraniikolic)</w:t>
-      </w:r>
-      <w:r>
-        <w:t xml:space="preserve">  ·  2026-09-24 22:49</w:t>
-      </w:r>
-    </w:p>
-    <w:p>
-      <w:pPr>
-        <w:spacing w:after="160"/>
-        <w:ind w:left="283"/>
-      </w:pPr>
-      <w:r>
-        <w:t>Tara je ispala iz love islanda,da li planirate susret?</w:t>
-      </w:r>
-    </w:p>
-    <w:p>
-      <w:r>
-        <w:rPr>
-          <w:b/>
-        </w:rPr>
-        <w:t xml:space="preserve">90.  0❤  </w:t>
-      </w:r>
-      <w:r>
-        <w:rPr>
-          <w:b/>
-        </w:rPr>
-        <w:t>Branko (@usermamrr)</w:t>
-      </w:r>
-      <w:r>
-        <w:t xml:space="preserve">  ·  2026-09-24 22:51</w:t>
-      </w:r>
-    </w:p>
-    <w:p>
-      <w:pPr>
-        <w:spacing w:after="160"/>
-        <w:ind w:left="283"/>
-      </w:pPr>
-      <w:r>
-        <w:t>oces li taru zvat vani sad kad je izašla iz vile?</w:t>
-      </w:r>
-    </w:p>
-    <w:p>
-      <w:r>
-        <w:rPr>
-          <w:b/>
-        </w:rPr>
-        <w:t xml:space="preserve">91.  0❤  </w:t>
-      </w:r>
-      <w:r>
-        <w:rPr>
-          <w:b/>
-        </w:rPr>
-        <w:t>Sanja Shalom (@sanjaraphaellahannaelle)</w:t>
-      </w:r>
-      <w:r>
-        <w:t xml:space="preserve">  ·  2026-09-24 22:52</w:t>
-      </w:r>
-    </w:p>
-    <w:p>
-      <w:pPr>
-        <w:spacing w:after="160"/>
-        <w:ind w:left="283"/>
-      </w:pPr>
-      <w:r>
-        <w:t>Hoćeš li se videti sa Tarom sad 🥰</w:t>
-      </w:r>
-    </w:p>
-    <w:p>
-      <w:r>
-        <w:rPr>
-          <w:b/>
-        </w:rPr>
-        <w:t xml:space="preserve">92.  0❤  </w:t>
-      </w:r>
-      <w:r>
-        <w:rPr>
-          <w:b/>
-        </w:rPr>
-        <w:t>brtttttdvvvu (@brtttttdvvvu)</w:t>
-      </w:r>
-      <w:r>
-        <w:t xml:space="preserve">  ·  2026-09-25 00:30</w:t>
-      </w:r>
-    </w:p>
-    <w:p>
-      <w:pPr>
-        <w:spacing w:after="160"/>
-        <w:ind w:left="283"/>
-      </w:pPr>
-      <w:r>
-        <w:t>Dali ces Pokušat opet biti sa tarom u rl ?</w:t>
-      </w:r>
-    </w:p>
-    <w:p>
-      <w:r>
-        <w:rPr>
-          <w:b/>
-        </w:rPr>
-        <w:t xml:space="preserve">93.  0❤  </w:t>
-      </w:r>
-      <w:r>
-        <w:rPr>
-          <w:b/>
-        </w:rPr>
-        <w:t>N🩷 (@nedzla.c)</w:t>
-      </w:r>
-      <w:r>
-        <w:t xml:space="preserve">  ·  2026-09-25 06:05</w:t>
-      </w:r>
-    </w:p>
-    <w:p>
-      <w:pPr>
-        <w:spacing w:after="160"/>
-        <w:ind w:left="283"/>
-      </w:pPr>
-      <w:r>
-        <w:t>jesi razdelio broj ili tik tok sa momcima I devojkama</w:t>
-      </w:r>
-    </w:p>
-    <w:p>
-      <w:r>
-        <w:rPr>
-          <w:b/>
-        </w:rPr>
-        <w:t xml:space="preserve">94.  0❤  </w:t>
-      </w:r>
-      <w:r>
-        <w:rPr>
-          <w:b/>
-        </w:rPr>
-        <w:t>𝔏𝔞𝔫𝔞 (@ichh_lanaa)</w:t>
-      </w:r>
-      <w:r>
-        <w:t xml:space="preserve">  ·  2026-09-25 09:01</w:t>
-      </w:r>
-    </w:p>
-    <w:p>
-      <w:pPr>
-        <w:spacing w:after="160"/>
-        <w:ind w:left="283"/>
-      </w:pPr>
-      <w:r>
-        <w:t>Jel ce se spojis sa tarom van love island??</w:t>
-      </w:r>
-    </w:p>
-    <w:p>
-      <w:r>
-        <w:rPr>
-          <w:b/>
-        </w:rPr>
-        <w:t xml:space="preserve">95.  0❤  </w:t>
-      </w:r>
-      <w:r>
-        <w:rPr>
-          <w:b/>
-        </w:rPr>
-        <w:t>Ena!🌸🩷 &gt;_&lt; (NO1 NAJIMI FAN) (@tvoja.lokalna.ena)</w:t>
-      </w:r>
-      <w:r>
-        <w:t xml:space="preserve">  ·  2026-09-25 13:24</w:t>
-      </w:r>
-    </w:p>
-    <w:p>
-      <w:pPr>
-        <w:spacing w:after="160"/>
-        <w:ind w:left="283"/>
-      </w:pPr>
-      <w:r>
-        <w:t>OBOŽAVAMO TE VUKAŠINEE BIO SI NAJBOLJIII❤️kao anime fan,koja ti je omiljena anime???</w:t>
-      </w:r>
-    </w:p>
-    <w:p>
-      <w:r>
-        <w:rPr>
-          <w:b/>
-        </w:rPr>
-        <w:t xml:space="preserve">96.  0❤  </w:t>
-      </w:r>
-      <w:r>
-        <w:rPr>
-          <w:b/>
-        </w:rPr>
-        <w:t>mira (@mira42917)</w:t>
-      </w:r>
-      <w:r>
-        <w:t xml:space="preserve">  ·  2026-09-25 14:21</w:t>
-      </w:r>
-    </w:p>
-    <w:p>
-      <w:pPr>
-        <w:spacing w:after="160"/>
-        <w:ind w:left="283"/>
-      </w:pPr>
-      <w:r>
         <w:t>Zaista je jako tužno videti reakcije publike. Love Island je poznat po dosta samoubistva. Toliko da u stranim državama imaju psihološke ispite i podrške pre, nakon i posle snimanja. Zanima me da li postoji nešto slično i ovde? (jer čisto sumnjam)</w:t>
-      </w:r>
-    </w:p>
-    <w:p>
-      <w:r>
-        <w:rPr>
-          <w:b/>
-        </w:rPr>
-        <w:t xml:space="preserve">97.  0❤  </w:t>
-      </w:r>
-      <w:r>
-        <w:rPr>
-          <w:b/>
-        </w:rPr>
-        <w:t>stefan✝ (@stefanvijinovic)</w:t>
-      </w:r>
-      <w:r>
-        <w:t xml:space="preserve">  ·  2026-09-25 15:15</w:t>
-      </w:r>
-    </w:p>
-    <w:p>
-      <w:pPr>
-        <w:spacing w:after="160"/>
-        <w:ind w:left="283"/>
-      </w:pPr>
-      <w:r>
-        <w:t>mozes li da kazes na svi zasto si morao da napustis vvl brothers bio je bas dobro akd si bio u vvl brothers</w:t>
       </w:r>
     </w:p>
     <w:sectPr>

</xml_diff>

<commit_message>
Ukloni ponovljena/slična pitanja iz DOCX liste
Kod duplikata ostaje verzija sa najviše lajkova (npr. Tara, momci/ulov).

Co-authored-by: DamboSlonce <DamboSlonce@users.noreply.github.com>
</commit_message>
<xml_diff>
--- a/Dokumentacija/TikTok_pitanja_vukasin_vvl_po_lajkovima.docx
+++ b/Dokumentacija/TikTok_pitanja_vukasin_vvl_po_lajkovima.docx
@@ -22,15 +22,17 @@
       <w:r>
         <w:t>Video: https://www.tiktok.com/@vukasin.vvl/video/7688407288696032532</w:t>
         <w:br/>
-        <w:t>Samo top-level pitanja, bez odgovora na komentare</w:t>
+        <w:t>Samo top-level pitanja</w:t>
         <w:br/>
-        <w:t>Isključeno: pitanja koja spominju VVL / VVL Brothers / Vid</w:t>
+        <w:t>Isključeno: VVL / VVL Brothers / Vid; ponovljena/slična pitanja</w:t>
         <w:br/>
-        <w:t>Broj pitanja: 84</w:t>
+        <w:t>Kod ponavljanja ostaje verzija sa najviše lajkova</w:t>
+        <w:br/>
+        <w:t>Broj pitanja: 56</w:t>
         <w:br/>
         <w:t>Sortiranje: opadajuće po lajkovima</w:t>
         <w:br/>
-        <w:t>Generisano: 2026-09-25 16:28 UTC</w:t>
+        <w:t>Generisano: 2026-09-26 10:37 UTC</w:t>
       </w:r>
     </w:p>
     <w:p/>
@@ -155,33 +157,7 @@
         <w:rPr>
           <w:b/>
         </w:rPr>
-        <w:t xml:space="preserve">5.  523❤  </w:t>
-      </w:r>
-      <w:r>
-        <w:rPr>
-          <w:b/>
-        </w:rPr>
-        <w:t>emy.core (@my.myself.i.core)</w:t>
-      </w:r>
-      <w:r>
-        <w:t xml:space="preserve">  ·  2026-09-22 19:12</w:t>
-      </w:r>
-    </w:p>
-    <w:p>
-      <w:pPr>
-        <w:spacing w:after="160"/>
-        <w:ind w:left="283"/>
-      </w:pPr>
-      <w:r>
-        <w:t>rekao si da su zene mid i da su momci ulov, da li ostajes pri tome?</w:t>
-      </w:r>
-    </w:p>
-    <w:p>
-      <w:r>
-        <w:rPr>
-          <w:b/>
-        </w:rPr>
-        <w:t xml:space="preserve">6.  281❤  </w:t>
+        <w:t xml:space="preserve">5.  281❤  </w:t>
       </w:r>
       <w:r>
         <w:rPr>
@@ -210,7 +186,7 @@
         <w:rPr>
           <w:b/>
         </w:rPr>
-        <w:t xml:space="preserve">7.  244❤  </w:t>
+        <w:t xml:space="preserve">6.  244❤  </w:t>
       </w:r>
       <w:r>
         <w:rPr>
@@ -239,62 +215,7 @@
         <w:rPr>
           <w:b/>
         </w:rPr>
-        <w:t xml:space="preserve">8.  111❤  </w:t>
-      </w:r>
-      <w:r>
-        <w:rPr>
-          <w:b/>
-        </w:rPr>
-        <w:t>I (@iskra.banovicc)</w:t>
-      </w:r>
-      <w:r>
-        <w:t xml:space="preserve">  ·  Liked by creator</w:t>
-      </w:r>
-      <w:r>
-        <w:t xml:space="preserve">  ·  2026-09-22 18:39</w:t>
-      </w:r>
-    </w:p>
-    <w:p>
-      <w:pPr>
-        <w:spacing w:after="160"/>
-        <w:ind w:left="283"/>
-      </w:pPr>
-      <w:r>
-        <w:t>Jel cete ti i tara da se čujete kada se love island zavrsi</w:t>
-      </w:r>
-    </w:p>
-    <w:p>
-      <w:r>
-        <w:rPr>
-          <w:b/>
-        </w:rPr>
-        <w:t xml:space="preserve">9.  39❤  </w:t>
-      </w:r>
-      <w:r>
-        <w:rPr>
-          <w:b/>
-        </w:rPr>
-        <w:t>ℒℯ𝓃𝓀𝒶🎞 (@llenka.obradovic)</w:t>
-      </w:r>
-      <w:r>
-        <w:t xml:space="preserve">  ·  2026-09-23 11:06</w:t>
-      </w:r>
-    </w:p>
-    <w:p>
-      <w:pPr>
-        <w:spacing w:after="160"/>
-        <w:ind w:left="283"/>
-      </w:pPr>
-      <w:r>
-        <w:t>Hoces li nastaviti da se viđas sa Tarom nakon love island</w:t>
-      </w:r>
-    </w:p>
-    <w:p>
-      <w:r>
-        <w:rPr>
-          <w:b/>
-        </w:rPr>
-        <w:t xml:space="preserve">10.  29❤  </w:t>
+        <w:t xml:space="preserve">7.  29❤  </w:t>
       </w:r>
       <w:r>
         <w:rPr>
@@ -323,7 +244,7 @@
         <w:rPr>
           <w:b/>
         </w:rPr>
-        <w:t xml:space="preserve">11.  16❤  </w:t>
+        <w:t xml:space="preserve">8.  16❤  </w:t>
       </w:r>
       <w:r>
         <w:rPr>
@@ -352,7 +273,7 @@
         <w:rPr>
           <w:b/>
         </w:rPr>
-        <w:t xml:space="preserve">12.  15❤  </w:t>
+        <w:t xml:space="preserve">9.  15❤  </w:t>
       </w:r>
       <w:r>
         <w:rPr>
@@ -378,7 +299,7 @@
         <w:rPr>
           <w:b/>
         </w:rPr>
-        <w:t xml:space="preserve">13.  15❤  </w:t>
+        <w:t xml:space="preserve">10.  15❤  </w:t>
       </w:r>
       <w:r>
         <w:rPr>
@@ -407,7 +328,7 @@
         <w:rPr>
           <w:b/>
         </w:rPr>
-        <w:t xml:space="preserve">14.  11❤  </w:t>
+        <w:t xml:space="preserve">11.  11❤  </w:t>
       </w:r>
       <w:r>
         <w:rPr>
@@ -433,36 +354,7 @@
         <w:rPr>
           <w:b/>
         </w:rPr>
-        <w:t xml:space="preserve">15.  10❤  </w:t>
-      </w:r>
-      <w:r>
-        <w:rPr>
-          <w:b/>
-        </w:rPr>
-        <w:t>🎀 (@katakolman)</w:t>
-      </w:r>
-      <w:r>
-        <w:t xml:space="preserve">  ·  Liked by creator</w:t>
-      </w:r>
-      <w:r>
-        <w:t xml:space="preserve">  ·  2026-09-22 17:38</w:t>
-      </w:r>
-    </w:p>
-    <w:p>
-      <w:pPr>
-        <w:spacing w:after="160"/>
-        <w:ind w:left="283"/>
-      </w:pPr>
-      <w:r>
-        <w:t>Ko te je najvise nervirao I da li si zamerio Luki sto ti je oteo devojku,koga bi izabrao da nisi izabrao Taru?</w:t>
-      </w:r>
-    </w:p>
-    <w:p>
-      <w:r>
-        <w:rPr>
-          <w:b/>
-        </w:rPr>
-        <w:t xml:space="preserve">16.  8❤  </w:t>
+        <w:t xml:space="preserve">12.  8❤  </w:t>
       </w:r>
       <w:r>
         <w:rPr>
@@ -491,33 +383,7 @@
         <w:rPr>
           <w:b/>
         </w:rPr>
-        <w:t xml:space="preserve">17.  7❤  </w:t>
-      </w:r>
-      <w:r>
-        <w:rPr>
-          <w:b/>
-        </w:rPr>
-        <w:t>🦕 (@unastojanovic3)</w:t>
-      </w:r>
-      <w:r>
-        <w:t xml:space="preserve">  ·  2026-09-22 19:51</w:t>
-      </w:r>
-    </w:p>
-    <w:p>
-      <w:pPr>
-        <w:spacing w:after="160"/>
-        <w:ind w:left="283"/>
-      </w:pPr>
-      <w:r>
-        <w:t>dali ti nedostaje Tara i jel ćete nastaviti da se vidjas snjom</w:t>
-      </w:r>
-    </w:p>
-    <w:p>
-      <w:r>
-        <w:rPr>
-          <w:b/>
-        </w:rPr>
-        <w:t xml:space="preserve">18.  6❤  </w:t>
+        <w:t xml:space="preserve">13.  6❤  </w:t>
       </w:r>
       <w:r>
         <w:rPr>
@@ -543,7 +409,7 @@
         <w:rPr>
           <w:b/>
         </w:rPr>
-        <w:t xml:space="preserve">19.  6❤  </w:t>
+        <w:t xml:space="preserve">14.  6❤  </w:t>
       </w:r>
       <w:r>
         <w:rPr>
@@ -572,7 +438,7 @@
         <w:rPr>
           <w:b/>
         </w:rPr>
-        <w:t xml:space="preserve">20.  6❤  </w:t>
+        <w:t xml:space="preserve">15.  6❤  </w:t>
       </w:r>
       <w:r>
         <w:rPr>
@@ -601,7 +467,7 @@
         <w:rPr>
           <w:b/>
         </w:rPr>
-        <w:t xml:space="preserve">21.  6❤  </w:t>
+        <w:t xml:space="preserve">16.  6❤  </w:t>
       </w:r>
       <w:r>
         <w:rPr>
@@ -627,7 +493,7 @@
         <w:rPr>
           <w:b/>
         </w:rPr>
-        <w:t xml:space="preserve">22.  5❤  </w:t>
+        <w:t xml:space="preserve">17.  5❤  </w:t>
       </w:r>
       <w:r>
         <w:rPr>
@@ -656,7 +522,7 @@
         <w:rPr>
           <w:b/>
         </w:rPr>
-        <w:t xml:space="preserve">23.  5❤  </w:t>
+        <w:t xml:space="preserve">18.  5❤  </w:t>
       </w:r>
       <w:r>
         <w:rPr>
@@ -685,85 +551,7 @@
         <w:rPr>
           <w:b/>
         </w:rPr>
-        <w:t xml:space="preserve">24.  5❤  </w:t>
-      </w:r>
-      <w:r>
-        <w:rPr>
-          <w:b/>
-        </w:rPr>
-        <w:t>Nikolina (@nikolina9481)</w:t>
-      </w:r>
-      <w:r>
-        <w:t xml:space="preserve">  ·  2026-09-22 18:45</w:t>
-      </w:r>
-    </w:p>
-    <w:p>
-      <w:pPr>
-        <w:spacing w:after="160"/>
-        <w:ind w:left="283"/>
-      </w:pPr>
-      <w:r>
-        <w:t>Da li ti nedostaje tara i koje je tvoje misljenje zato sto je luka ukrao od tebe</w:t>
-      </w:r>
-    </w:p>
-    <w:p>
-      <w:r>
-        <w:rPr>
-          <w:b/>
-        </w:rPr>
-        <w:t xml:space="preserve">25.  4❤  </w:t>
-      </w:r>
-      <w:r>
-        <w:rPr>
-          <w:b/>
-        </w:rPr>
-        <w:t>Tijana Devic (@tijana6290)</w:t>
-      </w:r>
-      <w:r>
-        <w:t xml:space="preserve">  ·  2026-09-22 17:56</w:t>
-      </w:r>
-    </w:p>
-    <w:p>
-      <w:pPr>
-        <w:spacing w:after="160"/>
-        <w:ind w:left="283"/>
-      </w:pPr>
-      <w:r>
-        <w:t>Dali ti fali Tara</w:t>
-      </w:r>
-    </w:p>
-    <w:p>
-      <w:r>
-        <w:rPr>
-          <w:b/>
-        </w:rPr>
-        <w:t xml:space="preserve">26.  4❤  </w:t>
-      </w:r>
-      <w:r>
-        <w:rPr>
-          <w:b/>
-        </w:rPr>
-        <w:t>☯️ (@msmsmsm002)</w:t>
-      </w:r>
-      <w:r>
-        <w:t xml:space="preserve">  ·  2026-09-22 19:21</w:t>
-      </w:r>
-    </w:p>
-    <w:p>
-      <w:pPr>
-        <w:spacing w:after="160"/>
-        <w:ind w:left="283"/>
-      </w:pPr>
-      <w:r>
-        <w:t>да ли је могуће да си изјавио да су момци бољи улов?</w:t>
-      </w:r>
-    </w:p>
-    <w:p>
-      <w:r>
-        <w:rPr>
-          <w:b/>
-        </w:rPr>
-        <w:t xml:space="preserve">27.  4❤  </w:t>
+        <w:t xml:space="preserve">19.  4❤  </w:t>
       </w:r>
       <w:r>
         <w:rPr>
@@ -789,33 +577,7 @@
         <w:rPr>
           <w:b/>
         </w:rPr>
-        <w:t xml:space="preserve">28.  4❤  </w:t>
-      </w:r>
-      <w:r>
-        <w:rPr>
-          <w:b/>
-        </w:rPr>
-        <w:t>Neda🎀 (@nedaradosavljevic)</w:t>
-      </w:r>
-      <w:r>
-        <w:t xml:space="preserve">  ·  2026-09-23 11:39</w:t>
-      </w:r>
-    </w:p>
-    <w:p>
-      <w:pPr>
-        <w:spacing w:after="160"/>
-        <w:ind w:left="283"/>
-      </w:pPr>
-      <w:r>
-        <w:t>Da li ćeš da nastaviš da budeš sa Tarom posle takmičenja</w:t>
-      </w:r>
-    </w:p>
-    <w:p>
-      <w:r>
-        <w:rPr>
-          <w:b/>
-        </w:rPr>
-        <w:t xml:space="preserve">29.  3❤  </w:t>
+        <w:t xml:space="preserve">20.  3❤  </w:t>
       </w:r>
       <w:r>
         <w:rPr>
@@ -841,36 +603,7 @@
         <w:rPr>
           <w:b/>
         </w:rPr>
-        <w:t xml:space="preserve">30.  3❤  </w:t>
-      </w:r>
-      <w:r>
-        <w:rPr>
-          <w:b/>
-        </w:rPr>
-        <w:t>Suzana (@suzaaanaaa1)</w:t>
-      </w:r>
-      <w:r>
-        <w:t xml:space="preserve">  ·  Liked by creator</w:t>
-      </w:r>
-      <w:r>
-        <w:t xml:space="preserve">  ·  2026-09-22 18:40</w:t>
-      </w:r>
-    </w:p>
-    <w:p>
-      <w:pPr>
-        <w:spacing w:after="160"/>
-        <w:ind w:left="283"/>
-      </w:pPr>
-      <w:r>
-        <w:t>da li ti se stvarno svidja Tara?</w:t>
-      </w:r>
-    </w:p>
-    <w:p>
-      <w:r>
-        <w:rPr>
-          <w:b/>
-        </w:rPr>
-        <w:t xml:space="preserve">31.  3❤  </w:t>
+        <w:t xml:space="preserve">21.  3❤  </w:t>
       </w:r>
       <w:r>
         <w:rPr>
@@ -896,7 +629,7 @@
         <w:rPr>
           <w:b/>
         </w:rPr>
-        <w:t xml:space="preserve">32.  3❤  </w:t>
+        <w:t xml:space="preserve">22.  3❤  </w:t>
       </w:r>
       <w:r>
         <w:rPr>
@@ -922,33 +655,7 @@
         <w:rPr>
           <w:b/>
         </w:rPr>
-        <w:t xml:space="preserve">33.  2❤  </w:t>
-      </w:r>
-      <w:r>
-        <w:rPr>
-          <w:b/>
-        </w:rPr>
-        <w:t>Brina (@brinabudicc)</w:t>
-      </w:r>
-      <w:r>
-        <w:t xml:space="preserve">  ·  2026-09-22 17:40</w:t>
-      </w:r>
-    </w:p>
-    <w:p>
-      <w:pPr>
-        <w:spacing w:after="160"/>
-        <w:ind w:left="283"/>
-      </w:pPr>
-      <w:r>
-        <w:t>Kako je sa produkcijom? Dali vam oni nareduju sta kazete kako se ponasati i fejkovane drame??</w:t>
-      </w:r>
-    </w:p>
-    <w:p>
-      <w:r>
-        <w:rPr>
-          <w:b/>
-        </w:rPr>
-        <w:t xml:space="preserve">34.  2❤  </w:t>
+        <w:t xml:space="preserve">23.  2❤  </w:t>
       </w:r>
       <w:r>
         <w:rPr>
@@ -974,7 +681,7 @@
         <w:rPr>
           <w:b/>
         </w:rPr>
-        <w:t xml:space="preserve">35.  2❤  </w:t>
+        <w:t xml:space="preserve">24.  2❤  </w:t>
       </w:r>
       <w:r>
         <w:rPr>
@@ -1000,7 +707,7 @@
         <w:rPr>
           <w:b/>
         </w:rPr>
-        <w:t xml:space="preserve">36.  2❤  </w:t>
+        <w:t xml:space="preserve">25.  2❤  </w:t>
       </w:r>
       <w:r>
         <w:rPr>
@@ -1026,33 +733,7 @@
         <w:rPr>
           <w:b/>
         </w:rPr>
-        <w:t xml:space="preserve">37.  2❤  </w:t>
-      </w:r>
-      <w:r>
-        <w:rPr>
-          <w:b/>
-        </w:rPr>
-        <w:t>jj (@jj73288)</w:t>
-      </w:r>
-      <w:r>
-        <w:t xml:space="preserve">  ·  2026-09-22 20:28</w:t>
-      </w:r>
-    </w:p>
-    <w:p>
-      <w:pPr>
-        <w:spacing w:after="160"/>
-        <w:ind w:left="283"/>
-      </w:pPr>
-      <w:r>
-        <w:t>Šta misliš o epizodi 8 i pocetak 9 ona tema koje je tvoje mišljenje</w:t>
-      </w:r>
-    </w:p>
-    <w:p>
-      <w:r>
-        <w:rPr>
-          <w:b/>
-        </w:rPr>
-        <w:t xml:space="preserve">38.  2❤  </w:t>
+        <w:t xml:space="preserve">26.  2❤  </w:t>
       </w:r>
       <w:r>
         <w:rPr>
@@ -1078,7 +759,7 @@
         <w:rPr>
           <w:b/>
         </w:rPr>
-        <w:t xml:space="preserve">39.  1❤  </w:t>
+        <w:t xml:space="preserve">27.  1❤  </w:t>
       </w:r>
       <w:r>
         <w:rPr>
@@ -1104,59 +785,7 @@
         <w:rPr>
           <w:b/>
         </w:rPr>
-        <w:t xml:space="preserve">40.  1❤  </w:t>
-      </w:r>
-      <w:r>
-        <w:rPr>
-          <w:b/>
-        </w:rPr>
-        <w:t>Anastaasijqq Kašikovićć (@anastasija.kasikovic)</w:t>
-      </w:r>
-      <w:r>
-        <w:t xml:space="preserve">  ·  2026-09-22 19:27</w:t>
-      </w:r>
-    </w:p>
-    <w:p>
-      <w:pPr>
-        <w:spacing w:after="160"/>
-        <w:ind w:left="283"/>
-      </w:pPr>
-      <w:r>
-        <w:t>Da li planiraš da se čujes sa Tarom???</w:t>
-      </w:r>
-    </w:p>
-    <w:p>
-      <w:r>
-        <w:rPr>
-          <w:b/>
-        </w:rPr>
-        <w:t xml:space="preserve">41.  1❤  </w:t>
-      </w:r>
-      <w:r>
-        <w:rPr>
-          <w:b/>
-        </w:rPr>
-        <w:t>Dunja Grozdanović (@dunja.groz)</w:t>
-      </w:r>
-      <w:r>
-        <w:t xml:space="preserve">  ·  2026-09-22 20:19</w:t>
-      </w:r>
-    </w:p>
-    <w:p>
-      <w:pPr>
-        <w:spacing w:after="160"/>
-        <w:ind w:left="283"/>
-      </w:pPr>
-      <w:r>
-        <w:t>Da li ces se javiti Tari posle kraja love islanda adrie?</w:t>
-      </w:r>
-    </w:p>
-    <w:p>
-      <w:r>
-        <w:rPr>
-          <w:b/>
-        </w:rPr>
-        <w:t xml:space="preserve">42.  1❤  </w:t>
+        <w:t xml:space="preserve">28.  1❤  </w:t>
       </w:r>
       <w:r>
         <w:rPr>
@@ -1182,7 +811,7 @@
         <w:rPr>
           <w:b/>
         </w:rPr>
-        <w:t xml:space="preserve">43.  1❤  </w:t>
+        <w:t xml:space="preserve">29.  1❤  </w:t>
       </w:r>
       <w:r>
         <w:rPr>
@@ -1208,59 +837,7 @@
         <w:rPr>
           <w:b/>
         </w:rPr>
-        <w:t xml:space="preserve">44.  1❤  </w:t>
-      </w:r>
-      <w:r>
-        <w:rPr>
-          <w:b/>
-        </w:rPr>
-        <w:t>Nađa🪼 (@nackica345)</w:t>
-      </w:r>
-      <w:r>
-        <w:t xml:space="preserve">  ·  2026-09-24 10:25</w:t>
-      </w:r>
-    </w:p>
-    <w:p>
-      <w:pPr>
-        <w:spacing w:after="160"/>
-        <w:ind w:left="283"/>
-      </w:pPr>
-      <w:r>
-        <w:t>da li ceš nakon takmicenja nastaviti da se vidjas sa tarom , čak iako se ne vratiš</w:t>
-      </w:r>
-    </w:p>
-    <w:p>
-      <w:r>
-        <w:rPr>
-          <w:b/>
-        </w:rPr>
-        <w:t xml:space="preserve">45.  1❤  </w:t>
-      </w:r>
-      <w:r>
-        <w:rPr>
-          <w:b/>
-        </w:rPr>
-        <w:t>🪽 (@_djinnqa1_)</w:t>
-      </w:r>
-      <w:r>
-        <w:t xml:space="preserve">  ·  2026-09-25 10:37</w:t>
-      </w:r>
-    </w:p>
-    <w:p>
-      <w:pPr>
-        <w:spacing w:after="160"/>
-        <w:ind w:left="283"/>
-      </w:pPr>
-      <w:r>
-        <w:t>Da li bih bio idalje sa Tarom kad se vrati iz vile?</w:t>
-      </w:r>
-    </w:p>
-    <w:p>
-      <w:r>
-        <w:rPr>
-          <w:b/>
-        </w:rPr>
-        <w:t xml:space="preserve">46.  0❤  </w:t>
+        <w:t xml:space="preserve">30.  0❤  </w:t>
       </w:r>
       <w:r>
         <w:rPr>
@@ -1286,7 +863,7 @@
         <w:rPr>
           <w:b/>
         </w:rPr>
-        <w:t xml:space="preserve">47.  0❤  </w:t>
+        <w:t xml:space="preserve">31.  0❤  </w:t>
       </w:r>
       <w:r>
         <w:rPr>
@@ -1312,7 +889,7 @@
         <w:rPr>
           <w:b/>
         </w:rPr>
-        <w:t xml:space="preserve">48.  0❤  </w:t>
+        <w:t xml:space="preserve">32.  0❤  </w:t>
       </w:r>
       <w:r>
         <w:rPr>
@@ -1338,7 +915,7 @@
         <w:rPr>
           <w:b/>
         </w:rPr>
-        <w:t xml:space="preserve">49.  0❤  </w:t>
+        <w:t xml:space="preserve">33.  0❤  </w:t>
       </w:r>
       <w:r>
         <w:rPr>
@@ -1364,61 +941,7 @@
         <w:rPr>
           <w:b/>
         </w:rPr>
-        <w:t xml:space="preserve">50.  0❤  </w:t>
-      </w:r>
-      <w:r>
-        <w:rPr>
-          <w:b/>
-        </w:rPr>
-        <w:t>j (@jovanadrai7)</w:t>
-      </w:r>
-      <w:r>
-        <w:t xml:space="preserve">  ·  2026-09-22 20:12</w:t>
-      </w:r>
-    </w:p>
-    <w:p>
-      <w:pPr>
-        <w:spacing w:after="160"/>
-        <w:ind w:left="283"/>
-      </w:pPr>
-      <w:r>
-        <w:t>Je l ti laknulo sto si otisao pre svega ovoga u osmoj epizodi ili bi branio zene?🫤</w:t>
-      </w:r>
-    </w:p>
-    <w:p>
-      <w:r>
-        <w:rPr>
-          <w:b/>
-        </w:rPr>
-        <w:t xml:space="preserve">51.  0❤  </w:t>
-      </w:r>
-      <w:r>
-        <w:rPr>
-          <w:b/>
-        </w:rPr>
-        <w:t>Leenna (@nisina.pelica0)</w:t>
-      </w:r>
-      <w:r>
-        <w:t xml:space="preserve">  ·  2026-09-22 21:17</w:t>
-      </w:r>
-    </w:p>
-    <w:p>
-      <w:pPr>
-        <w:spacing w:after="160"/>
-        <w:ind w:left="283"/>
-      </w:pPr>
-      <w:r>
-        <w:t>Da li ti ne doataje tara.</w:t>
-        <w:br/>
-        <w:t>Jasam se rasplakala kada sam videla taj deo i nisam mogla da stanem stvarno ste slatki🥺♥️</w:t>
-      </w:r>
-    </w:p>
-    <w:p>
-      <w:r>
-        <w:rPr>
-          <w:b/>
-        </w:rPr>
-        <w:t xml:space="preserve">52.  0❤  </w:t>
+        <w:t xml:space="preserve">34.  0❤  </w:t>
       </w:r>
       <w:r>
         <w:rPr>
@@ -1444,7 +967,7 @@
         <w:rPr>
           <w:b/>
         </w:rPr>
-        <w:t xml:space="preserve">53.  0❤  </w:t>
+        <w:t xml:space="preserve">35.  0❤  </w:t>
       </w:r>
       <w:r>
         <w:rPr>
@@ -1470,7 +993,7 @@
         <w:rPr>
           <w:b/>
         </w:rPr>
-        <w:t xml:space="preserve">54.  0❤  </w:t>
+        <w:t xml:space="preserve">36.  0❤  </w:t>
       </w:r>
       <w:r>
         <w:rPr>
@@ -1496,7 +1019,7 @@
         <w:rPr>
           <w:b/>
         </w:rPr>
-        <w:t xml:space="preserve">55.  0❤  </w:t>
+        <w:t xml:space="preserve">37.  0❤  </w:t>
       </w:r>
       <w:r>
         <w:rPr>
@@ -1524,7 +1047,7 @@
         <w:rPr>
           <w:b/>
         </w:rPr>
-        <w:t xml:space="preserve">56.  0❤  </w:t>
+        <w:t xml:space="preserve">38.  0❤  </w:t>
       </w:r>
       <w:r>
         <w:rPr>
@@ -1550,7 +1073,7 @@
         <w:rPr>
           <w:b/>
         </w:rPr>
-        <w:t xml:space="preserve">57.  0❤  </w:t>
+        <w:t xml:space="preserve">39.  0❤  </w:t>
       </w:r>
       <w:r>
         <w:rPr>
@@ -1576,7 +1099,7 @@
         <w:rPr>
           <w:b/>
         </w:rPr>
-        <w:t xml:space="preserve">58.  0❤  </w:t>
+        <w:t xml:space="preserve">40.  0❤  </w:t>
       </w:r>
       <w:r>
         <w:rPr>
@@ -1602,7 +1125,7 @@
         <w:rPr>
           <w:b/>
         </w:rPr>
-        <w:t xml:space="preserve">59.  0❤  </w:t>
+        <w:t xml:space="preserve">41.  0❤  </w:t>
       </w:r>
       <w:r>
         <w:rPr>
@@ -1628,7 +1151,7 @@
         <w:rPr>
           <w:b/>
         </w:rPr>
-        <w:t xml:space="preserve">60.  0❤  </w:t>
+        <w:t xml:space="preserve">42.  0❤  </w:t>
       </w:r>
       <w:r>
         <w:rPr>
@@ -1654,7 +1177,7 @@
         <w:rPr>
           <w:b/>
         </w:rPr>
-        <w:t xml:space="preserve">61.  0❤  </w:t>
+        <w:t xml:space="preserve">43.  0❤  </w:t>
       </w:r>
       <w:r>
         <w:rPr>
@@ -1680,7 +1203,7 @@
         <w:rPr>
           <w:b/>
         </w:rPr>
-        <w:t xml:space="preserve">62.  0❤  </w:t>
+        <w:t xml:space="preserve">44.  0❤  </w:t>
       </w:r>
       <w:r>
         <w:rPr>
@@ -1706,33 +1229,7 @@
         <w:rPr>
           <w:b/>
         </w:rPr>
-        <w:t xml:space="preserve">63.  0❤  </w:t>
-      </w:r>
-      <w:r>
-        <w:rPr>
-          <w:b/>
-        </w:rPr>
-        <w:t>zivot (@zivot304)</w:t>
-      </w:r>
-      <w:r>
-        <w:t xml:space="preserve">  ·  2026-09-23 14:26</w:t>
-      </w:r>
-    </w:p>
-    <w:p>
-      <w:pPr>
-        <w:spacing w:after="160"/>
-        <w:ind w:left="283"/>
-      </w:pPr>
-      <w:r>
-        <w:t>Jel moguce da se vratis ikako?</w:t>
-      </w:r>
-    </w:p>
-    <w:p>
-      <w:r>
-        <w:rPr>
-          <w:b/>
-        </w:rPr>
-        <w:t xml:space="preserve">64.  0❤  </w:t>
+        <w:t xml:space="preserve">45.  0❤  </w:t>
       </w:r>
       <w:r>
         <w:rPr>
@@ -1758,7 +1255,7 @@
         <w:rPr>
           <w:b/>
         </w:rPr>
-        <w:t xml:space="preserve">65.  0❤  </w:t>
+        <w:t xml:space="preserve">46.  0❤  </w:t>
       </w:r>
       <w:r>
         <w:rPr>
@@ -1784,7 +1281,7 @@
         <w:rPr>
           <w:b/>
         </w:rPr>
-        <w:t xml:space="preserve">66.  0❤  </w:t>
+        <w:t xml:space="preserve">47.  0❤  </w:t>
       </w:r>
       <w:r>
         <w:rPr>
@@ -1810,7 +1307,7 @@
         <w:rPr>
           <w:b/>
         </w:rPr>
-        <w:t xml:space="preserve">67.  0❤  </w:t>
+        <w:t xml:space="preserve">48.  0❤  </w:t>
       </w:r>
       <w:r>
         <w:rPr>
@@ -1836,7 +1333,7 @@
         <w:rPr>
           <w:b/>
         </w:rPr>
-        <w:t xml:space="preserve">68.  0❤  </w:t>
+        <w:t xml:space="preserve">49.  0❤  </w:t>
       </w:r>
       <w:r>
         <w:rPr>
@@ -1862,7 +1359,7 @@
         <w:rPr>
           <w:b/>
         </w:rPr>
-        <w:t xml:space="preserve">69.  0❤  </w:t>
+        <w:t xml:space="preserve">50.  0❤  </w:t>
       </w:r>
       <w:r>
         <w:rPr>
@@ -1888,33 +1385,7 @@
         <w:rPr>
           <w:b/>
         </w:rPr>
-        <w:t xml:space="preserve">70.  0❤  </w:t>
-      </w:r>
-      <w:r>
-        <w:rPr>
-          <w:b/>
-        </w:rPr>
-        <w:t>akiii🫶🏽🫶🏽🫶🏽 (@akikawqsqki)</w:t>
-      </w:r>
-      <w:r>
-        <w:t xml:space="preserve">  ·  2026-09-24 08:04</w:t>
-      </w:r>
-    </w:p>
-    <w:p>
-      <w:pPr>
-        <w:spacing w:after="160"/>
-        <w:ind w:left="283"/>
-      </w:pPr>
-      <w:r>
-        <w:t>da li ti se jos uvek svidja Tara i da li hoces posle opet da budete zajedno?</w:t>
-      </w:r>
-    </w:p>
-    <w:p>
-      <w:r>
-        <w:rPr>
-          <w:b/>
-        </w:rPr>
-        <w:t xml:space="preserve">71.  0❤  </w:t>
+        <w:t xml:space="preserve">51.  0❤  </w:t>
       </w:r>
       <w:r>
         <w:rPr>
@@ -1940,85 +1411,7 @@
         <w:rPr>
           <w:b/>
         </w:rPr>
-        <w:t xml:space="preserve">72.  0❤  </w:t>
-      </w:r>
-      <w:r>
-        <w:rPr>
-          <w:b/>
-        </w:rPr>
-        <w:t>Dorotea Montresor (@dorotea.montresor)</w:t>
-      </w:r>
-      <w:r>
-        <w:t xml:space="preserve">  ·  2026-09-24 18:28</w:t>
-      </w:r>
-    </w:p>
-    <w:p>
-      <w:pPr>
-        <w:spacing w:after="160"/>
-        <w:ind w:left="283"/>
-      </w:pPr>
-      <w:r>
-        <w:t>ces biti sa tarom</w:t>
-      </w:r>
-    </w:p>
-    <w:p>
-      <w:r>
-        <w:rPr>
-          <w:b/>
-        </w:rPr>
-        <w:t xml:space="preserve">73.  0❤  </w:t>
-      </w:r>
-      <w:r>
-        <w:rPr>
-          <w:b/>
-        </w:rPr>
-        <w:t>neda.radiv (@neda.radiv)</w:t>
-      </w:r>
-      <w:r>
-        <w:t xml:space="preserve">  ·  2026-09-24 18:53</w:t>
-      </w:r>
-    </w:p>
-    <w:p>
-      <w:pPr>
-        <w:spacing w:after="160"/>
-        <w:ind w:left="283"/>
-      </w:pPr>
-      <w:r>
-        <w:t>Što nisi pito Taru za instagram</w:t>
-      </w:r>
-    </w:p>
-    <w:p>
-      <w:r>
-        <w:rPr>
-          <w:b/>
-        </w:rPr>
-        <w:t xml:space="preserve">74.  0❤  </w:t>
-      </w:r>
-      <w:r>
-        <w:rPr>
-          <w:b/>
-        </w:rPr>
-        <w:t>Lana 🧸ྀི (@lana.mitrovi)</w:t>
-      </w:r>
-      <w:r>
-        <w:t xml:space="preserve">  ·  2026-09-24 19:36</w:t>
-      </w:r>
-    </w:p>
-    <w:p>
-      <w:pPr>
-        <w:spacing w:after="160"/>
-        <w:ind w:left="283"/>
-      </w:pPr>
-      <w:r>
-        <w:t>Da li ćemo da dobijemo reunion našeg najslađeg para nakon Tarinog ispadanja</w:t>
-      </w:r>
-    </w:p>
-    <w:p>
-      <w:r>
-        <w:rPr>
-          <w:b/>
-        </w:rPr>
-        <w:t xml:space="preserve">75.  0❤  </w:t>
+        <w:t xml:space="preserve">52.  0❤  </w:t>
       </w:r>
       <w:r>
         <w:rPr>
@@ -2044,7 +1437,7 @@
         <w:rPr>
           <w:b/>
         </w:rPr>
-        <w:t xml:space="preserve">76.  0❤  </w:t>
+        <w:t xml:space="preserve">53.  0❤  </w:t>
       </w:r>
       <w:r>
         <w:rPr>
@@ -2070,111 +1463,7 @@
         <w:rPr>
           <w:b/>
         </w:rPr>
-        <w:t xml:space="preserve">77.  0❤  </w:t>
-      </w:r>
-      <w:r>
-        <w:rPr>
-          <w:b/>
-        </w:rPr>
-        <w:t>laranikolic (@laraniikolic)</w:t>
-      </w:r>
-      <w:r>
-        <w:t xml:space="preserve">  ·  2026-09-24 22:49</w:t>
-      </w:r>
-    </w:p>
-    <w:p>
-      <w:pPr>
-        <w:spacing w:after="160"/>
-        <w:ind w:left="283"/>
-      </w:pPr>
-      <w:r>
-        <w:t>Tara je ispala iz love islanda,da li planirate susret?</w:t>
-      </w:r>
-    </w:p>
-    <w:p>
-      <w:r>
-        <w:rPr>
-          <w:b/>
-        </w:rPr>
-        <w:t xml:space="preserve">78.  0❤  </w:t>
-      </w:r>
-      <w:r>
-        <w:rPr>
-          <w:b/>
-        </w:rPr>
-        <w:t>Branko (@usermamrr)</w:t>
-      </w:r>
-      <w:r>
-        <w:t xml:space="preserve">  ·  2026-09-24 22:51</w:t>
-      </w:r>
-    </w:p>
-    <w:p>
-      <w:pPr>
-        <w:spacing w:after="160"/>
-        <w:ind w:left="283"/>
-      </w:pPr>
-      <w:r>
-        <w:t>oces li taru zvat vani sad kad je izašla iz vile?</w:t>
-      </w:r>
-    </w:p>
-    <w:p>
-      <w:r>
-        <w:rPr>
-          <w:b/>
-        </w:rPr>
-        <w:t xml:space="preserve">79.  0❤  </w:t>
-      </w:r>
-      <w:r>
-        <w:rPr>
-          <w:b/>
-        </w:rPr>
-        <w:t>Sanja Shalom (@sanjaraphaellahannaelle)</w:t>
-      </w:r>
-      <w:r>
-        <w:t xml:space="preserve">  ·  2026-09-24 22:52</w:t>
-      </w:r>
-    </w:p>
-    <w:p>
-      <w:pPr>
-        <w:spacing w:after="160"/>
-        <w:ind w:left="283"/>
-      </w:pPr>
-      <w:r>
-        <w:t>Hoćeš li se videti sa Tarom sad 🥰</w:t>
-      </w:r>
-    </w:p>
-    <w:p>
-      <w:r>
-        <w:rPr>
-          <w:b/>
-        </w:rPr>
-        <w:t xml:space="preserve">80.  0❤  </w:t>
-      </w:r>
-      <w:r>
-        <w:rPr>
-          <w:b/>
-        </w:rPr>
-        <w:t>brtttttdvvvu (@brtttttdvvvu)</w:t>
-      </w:r>
-      <w:r>
-        <w:t xml:space="preserve">  ·  2026-09-25 00:30</w:t>
-      </w:r>
-    </w:p>
-    <w:p>
-      <w:pPr>
-        <w:spacing w:after="160"/>
-        <w:ind w:left="283"/>
-      </w:pPr>
-      <w:r>
-        <w:t>Dali ces Pokušat opet biti sa tarom u rl ?</w:t>
-      </w:r>
-    </w:p>
-    <w:p>
-      <w:r>
-        <w:rPr>
-          <w:b/>
-        </w:rPr>
-        <w:t xml:space="preserve">81.  0❤  </w:t>
+        <w:t xml:space="preserve">54.  0❤  </w:t>
       </w:r>
       <w:r>
         <w:rPr>
@@ -2200,33 +1489,7 @@
         <w:rPr>
           <w:b/>
         </w:rPr>
-        <w:t xml:space="preserve">82.  0❤  </w:t>
-      </w:r>
-      <w:r>
-        <w:rPr>
-          <w:b/>
-        </w:rPr>
-        <w:t>𝔏𝔞𝔫𝔞 (@ichh_lanaa)</w:t>
-      </w:r>
-      <w:r>
-        <w:t xml:space="preserve">  ·  2026-09-25 09:01</w:t>
-      </w:r>
-    </w:p>
-    <w:p>
-      <w:pPr>
-        <w:spacing w:after="160"/>
-        <w:ind w:left="283"/>
-      </w:pPr>
-      <w:r>
-        <w:t>Jel ce se spojis sa tarom van love island??</w:t>
-      </w:r>
-    </w:p>
-    <w:p>
-      <w:r>
-        <w:rPr>
-          <w:b/>
-        </w:rPr>
-        <w:t xml:space="preserve">83.  0❤  </w:t>
+        <w:t xml:space="preserve">55.  0❤  </w:t>
       </w:r>
       <w:r>
         <w:rPr>
@@ -2252,7 +1515,7 @@
         <w:rPr>
           <w:b/>
         </w:rPr>
-        <w:t xml:space="preserve">84.  0❤  </w:t>
+        <w:t xml:space="preserve">56.  0❤  </w:t>
       </w:r>
       <w:r>
         <w:rPr>

</xml_diff>